<commit_message>
fix report simulation, results, conclusion
</commit_message>
<xml_diff>
--- a/report/Report1.docx
+++ b/report/Report1.docx
@@ -4,12 +4,14 @@
   <w:body>
     <w:p>
       <w:pPr>
-        <w:pStyle w:val="Title"/>
-      </w:pPr>
-    </w:p>
-    <w:p>
-      <w:pPr>
-        <w:pStyle w:val="Title"/>
+        <w:pStyle w:val="Titolo"/>
+        <w:ind w:firstLine="0"/>
+        <w:jc w:val="both"/>
+      </w:pPr>
+    </w:p>
+    <w:p>
+      <w:pPr>
+        <w:pStyle w:val="Titolo"/>
       </w:pPr>
       <w:r>
         <w:t>Report 01</w:t>
@@ -17,7 +19,7 @@
     </w:p>
     <w:p>
       <w:pPr>
-        <w:pStyle w:val="Subtitle"/>
+        <w:pStyle w:val="Sottotitolo"/>
       </w:pPr>
       <w:r>
         <w:t>Sensors, Embedded Systems and Algorithms for Service Robotics</w:t>
@@ -133,7 +135,7 @@
     </w:p>
     <w:p>
       <w:pPr>
-        <w:pStyle w:val="Heading1"/>
+        <w:pStyle w:val="Titolo1"/>
         <w:jc w:val="both"/>
         <w:rPr>
           <w:b/>
@@ -150,7 +152,15 @@
     </w:p>
     <w:p>
       <w:r>
-        <w:t xml:space="preserve">The main objective of this laboratory is to design a Bump&amp;Go controller to guide a TurtleBot3 through a path delimited by walls to reach a green target cube. To </w:t>
+        <w:t xml:space="preserve">The main objective of this laboratory is to design a </w:t>
+      </w:r>
+      <w:proofErr w:type="spellStart"/>
+      <w:r>
+        <w:t>Bump&amp;Go</w:t>
+      </w:r>
+      <w:proofErr w:type="spellEnd"/>
+      <w:r>
+        <w:t xml:space="preserve"> controller to guide a TurtleBot3 through a path delimited by walls to reach a green target cube. To </w:t>
       </w:r>
       <w:r>
         <w:t>achieve this,</w:t>
@@ -218,7 +228,15 @@
         <w:t>physical</w:t>
       </w:r>
       <w:r>
-        <w:t xml:space="preserve"> TurtleBot3. This requires handling the robot's </w:t>
+        <w:t xml:space="preserve"> TurtleBot3. This requires handling the </w:t>
+      </w:r>
+      <w:proofErr w:type="gramStart"/>
+      <w:r>
+        <w:t>robot's</w:t>
+      </w:r>
+      <w:proofErr w:type="gramEnd"/>
+      <w:r>
+        <w:t xml:space="preserve"> </w:t>
       </w:r>
       <w:r>
         <w:t>bring up</w:t>
@@ -229,13 +247,15 @@
     </w:p>
     <w:p>
       <w:r>
-        <w:t>Throughout both tasks, the exercises a</w:t>
-      </w:r>
-      <w:r>
-        <w:t xml:space="preserve"> </w:t>
-      </w:r>
-      <w:r>
-        <w:t>aim is to consolidate practical e</w:t>
+        <w:t xml:space="preserve">Throughout both tasks, the exercises </w:t>
+      </w:r>
+      <w:proofErr w:type="gramStart"/>
+      <w:r>
+        <w:t>a</w:t>
+      </w:r>
+      <w:proofErr w:type="gramEnd"/>
+      <w:r>
+        <w:t xml:space="preserve"> aim is to consolidate practical e</w:t>
       </w:r>
       <w:r>
         <w:t>xperience with</w:t>
@@ -258,7 +278,7 @@
     </w:p>
     <w:p>
       <w:pPr>
-        <w:pStyle w:val="Heading1"/>
+        <w:pStyle w:val="Titolo1"/>
         <w:jc w:val="both"/>
         <w:rPr>
           <w:b/>
@@ -298,7 +318,15 @@
     </w:p>
     <w:p>
       <w:r>
-        <w:t xml:space="preserve">The Bump&amp;Go controller designed to </w:t>
+        <w:t xml:space="preserve">The </w:t>
+      </w:r>
+      <w:proofErr w:type="spellStart"/>
+      <w:r>
+        <w:t>Bump&amp;Go</w:t>
+      </w:r>
+      <w:proofErr w:type="spellEnd"/>
+      <w:r>
+        <w:t xml:space="preserve"> controller designed to </w:t>
       </w:r>
       <w:r>
         <w:t>autonomously navigate</w:t>
@@ -361,6 +389,7 @@
         </w:rPr>
         <w:t xml:space="preserve"> </w:t>
       </w:r>
+      <w:proofErr w:type="spellStart"/>
       <w:r>
         <w:rPr>
           <w:b/>
@@ -368,6 +397,7 @@
         </w:rPr>
         <w:t>Bump&amp;Go</w:t>
       </w:r>
+      <w:proofErr w:type="spellEnd"/>
       <w:r>
         <w:rPr>
           <w:b/>
@@ -422,7 +452,21 @@
         <w:rPr>
           <w:lang w:val="en-GB"/>
         </w:rPr>
-        <w:t xml:space="preserve"> logic loop based on a Bump&amp;Go strategy, </w:t>
+        <w:t xml:space="preserve"> logic loop based on a </w:t>
+      </w:r>
+      <w:proofErr w:type="spellStart"/>
+      <w:r>
+        <w:rPr>
+          <w:lang w:val="en-GB"/>
+        </w:rPr>
+        <w:t>Bump&amp;Go</w:t>
+      </w:r>
+      <w:proofErr w:type="spellEnd"/>
+      <w:r>
+        <w:rPr>
+          <w:lang w:val="en-GB"/>
+        </w:rPr>
+        <w:t xml:space="preserve"> strategy, </w:t>
       </w:r>
       <w:r>
         <w:rPr>
@@ -556,7 +600,35 @@
         <w:rPr>
           <w:lang w:val="en-GB"/>
         </w:rPr>
-        <w:t xml:space="preserve"> and, upon completion, the robot automatically resumes its forward motion state. By continuously iterating this loop, the Bump&amp;Go controller successfully navigates the robot through the wall-delimited path to reach the final destination.</w:t>
+        <w:t xml:space="preserve"> and, upon completion, the robot automatically resumes its forward motion state. By continuously iterating this loop, the </w:t>
+      </w:r>
+      <w:proofErr w:type="spellStart"/>
+      <w:r>
+        <w:rPr>
+          <w:lang w:val="en-GB"/>
+        </w:rPr>
+        <w:t>Bump&amp;Go</w:t>
+      </w:r>
+      <w:proofErr w:type="spellEnd"/>
+      <w:r>
+        <w:rPr>
+          <w:lang w:val="en-GB"/>
+        </w:rPr>
+        <w:t xml:space="preserve"> controller successfully navigates the robot through the wall-delimited path to reach the </w:t>
+      </w:r>
+      <w:proofErr w:type="gramStart"/>
+      <w:r>
+        <w:rPr>
+          <w:lang w:val="en-GB"/>
+        </w:rPr>
+        <w:t>final destination</w:t>
+      </w:r>
+      <w:proofErr w:type="gramEnd"/>
+      <w:r>
+        <w:rPr>
+          <w:lang w:val="en-GB"/>
+        </w:rPr>
+        <w:t>.</w:t>
       </w:r>
       <w:r>
         <w:rPr>
@@ -615,7 +687,7 @@
     </w:p>
     <w:p>
       <w:pPr>
-        <w:pStyle w:val="Caption"/>
+        <w:pStyle w:val="Didascalia"/>
         <w:jc w:val="center"/>
       </w:pPr>
       <w:r>
@@ -657,14 +729,7 @@
           <w:b/>
           <w:bCs/>
         </w:rPr>
-        <w:t xml:space="preserve">II.3 </w:t>
-      </w:r>
-      <w:r>
-        <w:rPr>
-          <w:b/>
-          <w:bCs/>
-        </w:rPr>
-        <w:t>Python control node</w:t>
+        <w:t>II.3 Python control node</w:t>
       </w:r>
     </w:p>
     <w:p>
@@ -765,7 +830,21 @@
         <w:rPr>
           <w:lang w:val="en-GB"/>
         </w:rPr>
-        <w:t xml:space="preserve">/odom </w:t>
+        <w:t>/</w:t>
+      </w:r>
+      <w:proofErr w:type="spellStart"/>
+      <w:r>
+        <w:rPr>
+          <w:lang w:val="en-GB"/>
+        </w:rPr>
+        <w:t>odom</w:t>
+      </w:r>
+      <w:proofErr w:type="spellEnd"/>
+      <w:r>
+        <w:rPr>
+          <w:lang w:val="en-GB"/>
+        </w:rPr>
+        <w:t xml:space="preserve"> </w:t>
       </w:r>
       <w:r>
         <w:rPr>
@@ -845,7 +924,21 @@
         <w:rPr>
           <w:lang w:val="en-GB"/>
         </w:rPr>
-        <w:t xml:space="preserve">/ground_truth </w:t>
+        <w:t>/</w:t>
+      </w:r>
+      <w:proofErr w:type="spellStart"/>
+      <w:r>
+        <w:rPr>
+          <w:lang w:val="en-GB"/>
+        </w:rPr>
+        <w:t>ground_truth</w:t>
+      </w:r>
+      <w:proofErr w:type="spellEnd"/>
+      <w:r>
+        <w:rPr>
+          <w:lang w:val="en-GB"/>
+        </w:rPr>
+        <w:t xml:space="preserve"> </w:t>
       </w:r>
       <w:r>
         <w:rPr>
@@ -919,8 +1012,16 @@
         <w:rPr>
           <w:lang w:val="en-GB"/>
         </w:rPr>
-        <w:t>/cmd_vel</w:t>
-      </w:r>
+        <w:t>/</w:t>
+      </w:r>
+      <w:proofErr w:type="spellStart"/>
+      <w:r>
+        <w:rPr>
+          <w:lang w:val="en-GB"/>
+        </w:rPr>
+        <w:t>cmd_vel</w:t>
+      </w:r>
+      <w:proofErr w:type="spellEnd"/>
       <w:r>
         <w:rPr>
           <w:lang w:val="en-GB"/>
@@ -967,6 +1068,7 @@
       </w:pPr>
       <w:r>
         <w:rPr>
+          <w:noProof/>
           <w:lang w:val="en-GB"/>
         </w:rPr>
         <w:drawing>
@@ -1008,7 +1110,7 @@
     </w:p>
     <w:p>
       <w:pPr>
-        <w:pStyle w:val="Caption"/>
+        <w:pStyle w:val="Didascalia"/>
         <w:ind w:firstLine="708"/>
       </w:pPr>
       <w:r>
@@ -1042,13 +1144,21 @@
         <w:fldChar w:fldCharType="end"/>
       </w:r>
       <w:r>
-        <w:t xml:space="preserve"> R</w:t>
+        <w:t xml:space="preserve"> </w:t>
+      </w:r>
+      <w:proofErr w:type="spellStart"/>
+      <w:r>
+        <w:t>R</w:t>
       </w:r>
       <w:r>
         <w:t>q</w:t>
       </w:r>
       <w:r>
-        <w:t>t graph of communications</w:t>
+        <w:t>t</w:t>
+      </w:r>
+      <w:proofErr w:type="spellEnd"/>
+      <w:r>
+        <w:t xml:space="preserve"> graph of communications</w:t>
       </w:r>
     </w:p>
     <w:p>
@@ -1170,7 +1280,15 @@
       </w:r>
       <w:r>
         <w:lastRenderedPageBreak/>
-        <w:t>movement dynamics are often required</w:t>
+        <w:t xml:space="preserve">movement dynamics </w:t>
+      </w:r>
+      <w:proofErr w:type="gramStart"/>
+      <w:r>
+        <w:t>are</w:t>
+      </w:r>
+      <w:proofErr w:type="gramEnd"/>
+      <w:r>
+        <w:t xml:space="preserve"> often required</w:t>
       </w:r>
       <w:r>
         <w:rPr>
@@ -1184,9 +1302,11 @@
         </w:rPr>
         <w:t xml:space="preserve"> (</w:t>
       </w:r>
+      <w:proofErr w:type="spellStart"/>
       <w:r>
         <w:t>velMax</w:t>
       </w:r>
+      <w:proofErr w:type="spellEnd"/>
       <w:r>
         <w:t xml:space="preserve"> variable</w:t>
       </w:r>
@@ -1208,9 +1328,11 @@
         </w:rPr>
         <w:t xml:space="preserve"> (</w:t>
       </w:r>
+      <w:proofErr w:type="spellStart"/>
       <w:r>
         <w:t>velAngMax</w:t>
       </w:r>
+      <w:proofErr w:type="spellEnd"/>
       <w:r>
         <w:t>)</w:t>
       </w:r>
@@ -1226,9 +1348,11 @@
         </w:rPr>
         <w:t xml:space="preserve"> (</w:t>
       </w:r>
+      <w:proofErr w:type="spellStart"/>
       <w:r>
         <w:t>bumperThreshold</w:t>
       </w:r>
+      <w:proofErr w:type="spellEnd"/>
       <w:r>
         <w:rPr>
           <w:lang w:val="en-GB"/>
@@ -1470,7 +1594,7 @@
     </w:p>
     <w:p>
       <w:pPr>
-        <w:pStyle w:val="Heading2"/>
+        <w:pStyle w:val="Titolo2"/>
       </w:pPr>
       <w:r>
         <w:t>Task 1</w:t>
@@ -1504,7 +1628,21 @@
         <w:rPr>
           <w:lang w:val="en-GB"/>
         </w:rPr>
-        <w:t xml:space="preserve"> implemented through a continuous logic loop based on a Bump&amp;Go strategy</w:t>
+        <w:t xml:space="preserve"> implemented through a continuous logic loop based on a </w:t>
+      </w:r>
+      <w:proofErr w:type="spellStart"/>
+      <w:r>
+        <w:rPr>
+          <w:lang w:val="en-GB"/>
+        </w:rPr>
+        <w:t>Bump&amp;Go</w:t>
+      </w:r>
+      <w:proofErr w:type="spellEnd"/>
+      <w:r>
+        <w:rPr>
+          <w:lang w:val="en-GB"/>
+        </w:rPr>
+        <w:t xml:space="preserve"> strategy</w:t>
       </w:r>
       <w:r>
         <w:rPr>
@@ -1547,14 +1685,313 @@
         <w:rPr>
           <w:lang w:val="en-GB"/>
         </w:rPr>
+        <w:t xml:space="preserve"> in </w:t>
+      </w:r>
+      <w:proofErr w:type="spellStart"/>
+      <w:r>
+        <w:t>sensor_msgs</w:t>
+      </w:r>
+      <w:proofErr w:type="spellEnd"/>
+      <w:r>
+        <w:t>/</w:t>
+      </w:r>
+      <w:r>
+        <w:t>msg</w:t>
+      </w:r>
+      <w:r>
+        <w:t>/</w:t>
+      </w:r>
+      <w:proofErr w:type="spellStart"/>
+      <w:r>
+        <w:t>LaserScan</w:t>
+      </w:r>
+      <w:proofErr w:type="spellEnd"/>
+      <w:r>
+        <w:t xml:space="preserve"> type message. </w:t>
+      </w:r>
+      <w:r>
+        <w:rPr>
+          <w:lang w:val="en-GB"/>
+        </w:rPr>
+        <w:t>This message contains various data</w:t>
+      </w:r>
+      <w:r>
+        <w:rPr>
+          <w:lang w:val="en-GB"/>
+        </w:rPr>
+        <w:t xml:space="preserve">, </w:t>
+      </w:r>
+      <w:proofErr w:type="spellStart"/>
+      <w:r>
+        <w:t>angle_min</w:t>
+      </w:r>
+      <w:proofErr w:type="spellEnd"/>
+      <w:r>
+        <w:t xml:space="preserve">, </w:t>
+      </w:r>
+      <w:proofErr w:type="spellStart"/>
+      <w:r>
+        <w:t>angle_max</w:t>
+      </w:r>
+      <w:proofErr w:type="spellEnd"/>
+      <w:r>
         <w:t xml:space="preserve"> </w:t>
       </w:r>
       <w:r>
-        <w:rPr>
-          <w:lang w:val="en-GB"/>
-        </w:rPr>
+        <w:t xml:space="preserve">and </w:t>
+      </w:r>
+      <w:proofErr w:type="spellStart"/>
+      <w:r>
+        <w:t>angle_increment</w:t>
+      </w:r>
+      <w:proofErr w:type="spellEnd"/>
+      <w:r>
+        <w:rPr>
+          <w:lang w:val="en-GB"/>
+        </w:rPr>
+        <w:t xml:space="preserve"> </w:t>
+      </w:r>
+      <w:r>
+        <w:rPr>
+          <w:lang w:val="en-GB"/>
+        </w:rPr>
+        <w:t xml:space="preserve">are respectively </w:t>
+      </w:r>
+      <w:r>
+        <w:rPr>
+          <w:lang w:val="en-GB"/>
+        </w:rPr>
+        <w:t>start</w:t>
+      </w:r>
+      <w:r>
+        <w:rPr>
+          <w:lang w:val="en-GB"/>
+        </w:rPr>
+        <w:t xml:space="preserve"> angle of scan, end angle of scan and angle increment between each Lidar </w:t>
+      </w:r>
+      <w:r>
+        <w:rPr>
+          <w:lang w:val="en-GB"/>
+        </w:rPr>
+        <w:t>ray, range</w:t>
+      </w:r>
+      <w:r>
+        <w:t>_</w:t>
+      </w:r>
+      <w:r>
+        <w:t xml:space="preserve">min and </w:t>
+      </w:r>
+      <w:proofErr w:type="spellStart"/>
+      <w:r>
+        <w:t>range_max</w:t>
+      </w:r>
+      <w:proofErr w:type="spellEnd"/>
+      <w:r>
+        <w:t xml:space="preserve"> are </w:t>
+      </w:r>
+      <w:r>
+        <w:t>minimum </w:t>
+      </w:r>
+      <w:r>
+        <w:t xml:space="preserve">and maximum </w:t>
+      </w:r>
+      <w:r>
+        <w:t>range value</w:t>
+      </w:r>
+      <w:r>
+        <w:t>, the ra</w:t>
+      </w:r>
+      <w:r>
+        <w:t>n</w:t>
+      </w:r>
+      <w:r>
+        <w:t xml:space="preserve">ges data are </w:t>
+      </w:r>
+      <w:r>
+        <w:t>contained</w:t>
+      </w:r>
+      <w:r>
+        <w:t xml:space="preserve"> in </w:t>
+      </w:r>
+      <w:proofErr w:type="gramStart"/>
+      <w:r>
+        <w:t>ranges</w:t>
+      </w:r>
+      <w:r>
+        <w:t>[</w:t>
+      </w:r>
+      <w:proofErr w:type="gramEnd"/>
+      <w:r>
+        <w:t xml:space="preserve">] vector, a vector of float that contains </w:t>
+      </w:r>
+      <w:r>
+        <w:t>easement</w:t>
+      </w:r>
+      <w:r>
+        <w:t xml:space="preserve"> for eac</w:t>
+      </w:r>
+      <w:r>
+        <w:t>h</w:t>
+      </w:r>
+      <w:r>
+        <w:t xml:space="preserve"> angle, this vector has </w:t>
+      </w:r>
+      <w:r>
+        <w:t xml:space="preserve">a variable length and therefore </w:t>
+      </w:r>
+      <w:proofErr w:type="spellStart"/>
+      <w:r>
+        <w:t>angle_min</w:t>
+      </w:r>
+      <w:proofErr w:type="spellEnd"/>
+      <w:r>
+        <w:t xml:space="preserve">, </w:t>
+      </w:r>
+      <w:proofErr w:type="spellStart"/>
+      <w:r>
+        <w:t>angle_max</w:t>
+      </w:r>
+      <w:proofErr w:type="spellEnd"/>
+      <w:r>
+        <w:t xml:space="preserve"> </w:t>
+      </w:r>
+      <w:r>
+        <w:t xml:space="preserve">and </w:t>
+      </w:r>
+      <w:proofErr w:type="spellStart"/>
+      <w:r>
+        <w:t>angle_increment</w:t>
+      </w:r>
+      <w:proofErr w:type="spellEnd"/>
+      <w:r>
+        <w:t xml:space="preserve"> have to be used to treat </w:t>
+      </w:r>
+      <w:r>
+        <w:t xml:space="preserve">with </w:t>
+      </w:r>
+      <w:r>
+        <w:t>it.</w:t>
+      </w:r>
+    </w:p>
+    <w:p>
+      <w:r>
+        <w:rPr>
+          <w:lang w:val="en-GB"/>
+        </w:rPr>
+        <w:t xml:space="preserve">For each Lidar scan </w:t>
+      </w:r>
+      <w:r>
+        <w:rPr>
+          <w:lang w:val="en-GB"/>
+        </w:rPr>
+        <w:t>a dedicated callback</w:t>
+      </w:r>
+      <w:r>
+        <w:rPr>
+          <w:lang w:val="en-GB"/>
+        </w:rPr>
+        <w:t xml:space="preserve"> method </w:t>
+      </w:r>
+      <w:proofErr w:type="spellStart"/>
+      <w:proofErr w:type="gramStart"/>
+      <w:r>
+        <w:t>LidarCallback</w:t>
+      </w:r>
+      <w:proofErr w:type="spellEnd"/>
+      <w:r>
+        <w:t>(</w:t>
+      </w:r>
+      <w:proofErr w:type="gramEnd"/>
+      <w:r>
+        <w:t>)</w:t>
+      </w:r>
+      <w:r>
+        <w:rPr>
+          <w:lang w:val="en-GB"/>
+        </w:rPr>
+        <w:t xml:space="preserve"> processes the raw sensor data. To account for measurement noise and out-of-bounds readings, the recorded distance arrays are </w:t>
+      </w:r>
+      <w:r>
+        <w:rPr>
+          <w:lang w:val="en-GB"/>
+        </w:rPr>
+        <w:t>pre-processed</w:t>
+      </w:r>
+      <w:r>
+        <w:rPr>
+          <w:lang w:val="en-GB"/>
+        </w:rPr>
+        <w:t xml:space="preserve"> by capping the values to the sensor's reliable minimum and maximum limits</w:t>
+      </w:r>
+      <w:r>
+        <w:rPr>
+          <w:lang w:val="en-GB"/>
+        </w:rPr>
+        <w:t xml:space="preserve"> (</w:t>
+      </w:r>
+      <w:proofErr w:type="spellStart"/>
+      <w:r>
+        <w:t>range_m</w:t>
+      </w:r>
+      <w:r>
         <w:t>in</w:t>
       </w:r>
+      <w:proofErr w:type="spellEnd"/>
+      <w:r>
+        <w:t xml:space="preserve"> and </w:t>
+      </w:r>
+      <w:proofErr w:type="spellStart"/>
+      <w:r>
+        <w:t>range_max</w:t>
+      </w:r>
+      <w:proofErr w:type="spellEnd"/>
+      <w:r>
+        <w:t xml:space="preserve"> values)</w:t>
+      </w:r>
+      <w:r>
+        <w:rPr>
+          <w:lang w:val="en-GB"/>
+        </w:rPr>
+        <w:t xml:space="preserve">. </w:t>
+      </w:r>
+      <w:r>
+        <w:rPr>
+          <w:lang w:val="en-GB"/>
+        </w:rPr>
+        <w:t xml:space="preserve">The conditioned data is then passed </w:t>
+      </w:r>
+      <w:r>
+        <w:rPr>
+          <w:lang w:val="en-GB"/>
+        </w:rPr>
+        <w:t xml:space="preserve">to </w:t>
+      </w:r>
+      <w:proofErr w:type="gramStart"/>
+      <w:r>
+        <w:rPr>
+          <w:lang w:val="en-GB"/>
+        </w:rPr>
+        <w:t>moving</w:t>
+      </w:r>
+      <w:r>
+        <w:rPr>
+          <w:lang w:val="en-GB"/>
+        </w:rPr>
+        <w:t>(</w:t>
+      </w:r>
+      <w:proofErr w:type="gramEnd"/>
+      <w:r>
+        <w:rPr>
+          <w:lang w:val="en-GB"/>
+        </w:rPr>
+        <w:t>)</w:t>
+      </w:r>
+      <w:r>
+        <w:rPr>
+          <w:lang w:val="en-GB"/>
+        </w:rPr>
+        <w:t xml:space="preserve"> method, which dictates the robot's kinematic behaviour.</w:t>
+      </w:r>
       <w:r>
         <w:rPr>
           <w:lang w:val="en-GB"/>
@@ -1562,699 +1999,525 @@
         <w:t xml:space="preserve"> </w:t>
       </w:r>
       <w:r>
-        <w:t>sensor_msgs</w:t>
-      </w:r>
+        <w:rPr>
+          <w:lang w:val="en-GB"/>
+        </w:rPr>
+        <w:t>In the forward motion state, the controller extracts a 10-degree</w:t>
+      </w:r>
+      <w:r>
+        <w:rPr>
+          <w:lang w:val="en-GB"/>
+        </w:rPr>
+        <w:t xml:space="preserve"> </w:t>
+      </w:r>
+      <w:r>
+        <w:rPr>
+          <w:lang w:val="en-GB"/>
+        </w:rPr>
+        <w:t xml:space="preserve">field of view </w:t>
+      </w:r>
+      <w:r>
+        <w:rPr>
+          <w:lang w:val="en-GB"/>
+        </w:rPr>
+        <w:t xml:space="preserve">(calculated through </w:t>
+      </w:r>
+      <w:proofErr w:type="spellStart"/>
+      <w:r>
+        <w:rPr>
+          <w:lang w:val="en-GB"/>
+        </w:rPr>
+        <w:t>angle_increment</w:t>
+      </w:r>
+      <w:proofErr w:type="spellEnd"/>
+      <w:r>
+        <w:rPr>
+          <w:lang w:val="en-GB"/>
+        </w:rPr>
+        <w:t xml:space="preserve"> value</w:t>
+      </w:r>
+      <w:r>
+        <w:rPr>
+          <w:lang w:val="en-GB"/>
+        </w:rPr>
+        <w:t xml:space="preserve"> given in scan message</w:t>
+      </w:r>
+      <w:r>
+        <w:rPr>
+          <w:lang w:val="en-GB"/>
+        </w:rPr>
+        <w:t>)</w:t>
+      </w:r>
+      <w:r>
+        <w:rPr>
+          <w:lang w:val="en-GB"/>
+        </w:rPr>
+        <w:t xml:space="preserve"> directly in front of the robot. A median filter is applied to this subset to reject Gaussian noise and prevent false obstacle detection. If the evaluated frontal distance falls below the established safety threshold, the robot halts and triggers the turning sequence</w:t>
+      </w:r>
+      <w:r>
+        <w:rPr>
+          <w:lang w:val="en-GB"/>
+        </w:rPr>
+        <w:t xml:space="preserve">, the turning section will </w:t>
+      </w:r>
+      <w:r>
+        <w:rPr>
+          <w:lang w:val="en-GB"/>
+        </w:rPr>
+        <w:t xml:space="preserve">start as the next </w:t>
+      </w:r>
+      <w:proofErr w:type="spellStart"/>
+      <w:r>
+        <w:rPr>
+          <w:lang w:val="en-GB"/>
+        </w:rPr>
+        <w:t>Laserscan</w:t>
+      </w:r>
+      <w:proofErr w:type="spellEnd"/>
+      <w:r>
+        <w:rPr>
+          <w:lang w:val="en-GB"/>
+        </w:rPr>
+        <w:t xml:space="preserve"> message arrives</w:t>
+      </w:r>
+      <w:r>
+        <w:rPr>
+          <w:lang w:val="en-GB"/>
+        </w:rPr>
+        <w:t>. Otherwise, it maintains its forward trajectory.</w:t>
+      </w:r>
+    </w:p>
+    <w:p>
+      <w:pPr>
+        <w:rPr>
+          <w:lang w:val="en-GB"/>
+        </w:rPr>
+      </w:pPr>
+      <w:r>
+        <w:rPr>
+          <w:lang w:val="en-GB"/>
+        </w:rPr>
+        <w:t xml:space="preserve">In case of the robot being under the threshold distance the rotation phase starts. </w:t>
+      </w:r>
+      <w:r>
+        <w:t xml:space="preserve">Initially, the direction of rotation must be determined, </w:t>
+      </w:r>
+      <w:r>
+        <w:rPr>
+          <w:lang w:val="en-GB"/>
+        </w:rPr>
+        <w:t>due to variability of the dimension of the lidars scan ranges vector the +90 and -90 degree direction are evaluated dynamically, the 25% (for +90) and the 75%</w:t>
+      </w:r>
+      <w:r>
+        <w:rPr>
+          <w:lang w:val="en-GB"/>
+        </w:rPr>
+        <w:t xml:space="preserve"> </w:t>
+      </w:r>
+      <w:r>
+        <w:rPr>
+          <w:lang w:val="en-GB"/>
+        </w:rPr>
+        <w:t xml:space="preserve">(for -90) index position of the ranges vector are taken in account, from there we take a range of 10 degrees for both, remove gaussian error with a median, the direction of movement is detected by the maximum possible space between the two. </w:t>
+      </w:r>
+    </w:p>
+    <w:p>
+      <w:r>
+        <w:rPr>
+          <w:lang w:val="en-GB"/>
+        </w:rPr>
+        <w:t>From /</w:t>
+      </w:r>
+      <w:proofErr w:type="spellStart"/>
+      <w:r>
+        <w:rPr>
+          <w:lang w:val="en-GB"/>
+        </w:rPr>
+        <w:t>odom</w:t>
+      </w:r>
+      <w:proofErr w:type="spellEnd"/>
+      <w:r>
+        <w:rPr>
+          <w:lang w:val="en-GB"/>
+        </w:rPr>
+        <w:t xml:space="preserve"> topic</w:t>
+      </w:r>
+      <w:r>
+        <w:rPr>
+          <w:lang w:val="en-GB"/>
+        </w:rPr>
+        <w:t xml:space="preserve"> subscription</w:t>
+      </w:r>
+      <w:r>
+        <w:rPr>
+          <w:lang w:val="en-GB"/>
+        </w:rPr>
+        <w:t xml:space="preserve"> the message </w:t>
+      </w:r>
+      <w:proofErr w:type="spellStart"/>
+      <w:r>
+        <w:t>nav_msgs</w:t>
+      </w:r>
+      <w:proofErr w:type="spellEnd"/>
       <w:r>
         <w:t>/</w:t>
       </w:r>
       <w:r>
+        <w:t xml:space="preserve">msg </w:t>
+      </w:r>
+      <w:r>
+        <w:t>/</w:t>
+      </w:r>
+      <w:r>
+        <w:t>Odometry</w:t>
+      </w:r>
+      <w:r>
+        <w:t xml:space="preserve"> is retrieved, this message contains pose and twists message, the pose message </w:t>
+      </w:r>
+      <w:r>
+        <w:t>estimates</w:t>
+      </w:r>
+      <w:r>
+        <w:t xml:space="preserve"> robot position and </w:t>
+      </w:r>
+      <w:r>
+        <w:t>orientation.</w:t>
+      </w:r>
+      <w:r>
+        <w:t xml:space="preserve"> The </w:t>
+      </w:r>
+      <w:proofErr w:type="spellStart"/>
+      <w:proofErr w:type="gramStart"/>
+      <w:r>
+        <w:t>odomCallback</w:t>
+      </w:r>
+      <w:proofErr w:type="spellEnd"/>
+      <w:r>
+        <w:t>(</w:t>
+      </w:r>
+      <w:proofErr w:type="gramEnd"/>
+      <w:r>
+        <w:t>)</w:t>
+      </w:r>
+      <w:r>
+        <w:t xml:space="preserve"> callback method </w:t>
+      </w:r>
+      <w:r>
+        <w:t>extracts the quaternion of robot’s current pose</w:t>
+      </w:r>
+      <w:r>
+        <w:t>, with a prebuilt function is possible to convert it in Euler angles and get the yaw angle (</w:t>
+      </w:r>
+      <w:proofErr w:type="spellStart"/>
+      <w:r>
+        <w:t>current_yaw</w:t>
+      </w:r>
+      <w:proofErr w:type="spellEnd"/>
+      <w:r>
+        <w:t>) for algorithm porpoises.</w:t>
+      </w:r>
+    </w:p>
+    <w:p>
+      <w:pPr>
+        <w:rPr>
+          <w:lang w:val="en-GB"/>
+        </w:rPr>
+      </w:pPr>
+      <w:r>
+        <w:rPr>
+          <w:lang w:val="en-GB"/>
+        </w:rPr>
+        <w:t>The target yaw is calculated</w:t>
+      </w:r>
+      <w:r>
+        <w:rPr>
+          <w:lang w:val="en-GB"/>
+        </w:rPr>
+        <w:t xml:space="preserve"> starting from </w:t>
+      </w:r>
+      <w:proofErr w:type="spellStart"/>
+      <w:r>
+        <w:rPr>
+          <w:lang w:val="en-GB"/>
+        </w:rPr>
+        <w:t>current_yaw</w:t>
+      </w:r>
+      <w:proofErr w:type="spellEnd"/>
+      <w:r>
+        <w:rPr>
+          <w:lang w:val="en-GB"/>
+        </w:rPr>
+        <w:t xml:space="preserve"> and adding the previous calculated rotation angle to get </w:t>
+      </w:r>
+      <w:r>
+        <w:rPr>
+          <w:lang w:val="en-GB"/>
+        </w:rPr>
+        <w:t>final direction.</w:t>
+      </w:r>
+    </w:p>
+    <w:p>
+      <w:pPr>
+        <w:rPr>
+          <w:lang w:val="en-GB"/>
+        </w:rPr>
+      </w:pPr>
+      <w:r>
+        <w:rPr>
+          <w:lang w:val="en-GB"/>
+        </w:rPr>
+        <w:t>The actual rotation starts after the next laser scan, a proportional controller is implemented taking in account the error calculated by subtracting desired yaw</w:t>
+      </w:r>
+      <w:r>
+        <w:rPr>
+          <w:lang w:val="en-GB"/>
+        </w:rPr>
+        <w:t xml:space="preserve"> </w:t>
+      </w:r>
+      <w:r>
+        <w:rPr>
+          <w:lang w:val="en-GB"/>
+        </w:rPr>
+        <w:t xml:space="preserve">(previously normalized) and the current yaw (retrieved by </w:t>
+      </w:r>
+      <w:proofErr w:type="spellStart"/>
+      <w:r>
+        <w:rPr>
+          <w:lang w:val="en-GB"/>
+        </w:rPr>
+        <w:t>odom</w:t>
+      </w:r>
+      <w:proofErr w:type="spellEnd"/>
+      <w:r>
+        <w:rPr>
+          <w:lang w:val="en-GB"/>
+        </w:rPr>
+        <w:t xml:space="preserve"> topic read), the </w:t>
+      </w:r>
+      <w:proofErr w:type="spellStart"/>
+      <w:r>
+        <w:rPr>
+          <w:lang w:val="en-GB"/>
+        </w:rPr>
+        <w:t>Kp</w:t>
+      </w:r>
+      <w:proofErr w:type="spellEnd"/>
+      <w:r>
+        <w:rPr>
+          <w:lang w:val="en-GB"/>
+        </w:rPr>
+        <w:t xml:space="preserve"> is chosen and 0.5 of to ensure a smooth rotation and the target angle can be reached with a 0.02 rad of error.</w:t>
+      </w:r>
+    </w:p>
+    <w:p>
+      <w:pPr>
+        <w:rPr>
+          <w:lang w:val="en-GB"/>
+        </w:rPr>
+      </w:pPr>
+      <w:r>
+        <w:rPr>
+          <w:lang w:val="en-GB"/>
+        </w:rPr>
+        <w:t>After the rotation the robot returns in the forward motion state and starts to move in the new direction.</w:t>
+      </w:r>
+    </w:p>
+    <w:p>
+      <w:r>
+        <w:rPr>
+          <w:lang w:val="en-GB"/>
+        </w:rPr>
+        <w:t>The actual movement</w:t>
+      </w:r>
+      <w:r>
+        <w:rPr>
+          <w:lang w:val="en-GB"/>
+        </w:rPr>
+        <w:t xml:space="preserve"> commands are sent through the /</w:t>
+      </w:r>
+      <w:proofErr w:type="spellStart"/>
+      <w:r>
+        <w:rPr>
+          <w:lang w:val="en-GB"/>
+        </w:rPr>
+        <w:t>cmd_vel</w:t>
+      </w:r>
+      <w:proofErr w:type="spellEnd"/>
+      <w:r>
+        <w:rPr>
+          <w:lang w:val="en-GB"/>
+        </w:rPr>
+        <w:t xml:space="preserve"> topic, in </w:t>
+      </w:r>
+      <w:proofErr w:type="spellStart"/>
+      <w:r>
+        <w:t>geometry_msgs</w:t>
+      </w:r>
+      <w:proofErr w:type="spellEnd"/>
+      <w:r>
+        <w:t>/</w:t>
+      </w:r>
+      <w:r>
         <w:t>msg</w:t>
       </w:r>
       <w:r>
         <w:t>/</w:t>
       </w:r>
       <w:r>
-        <w:t>LaserScan</w:t>
-      </w:r>
-      <w:r>
+        <w:t>Twist</w:t>
+      </w:r>
+      <w:r>
+        <w:t xml:space="preserve"> type message. This message accepts 2 </w:t>
+      </w:r>
+      <w:r>
+        <w:t>vectors</w:t>
+      </w:r>
+      <w:r>
+        <w:t xml:space="preserve"> of dimension 3, in the first message the liner velocity is specified for x, y and z, and the </w:t>
+      </w:r>
+      <w:r>
+        <w:t>angular</w:t>
+      </w:r>
+      <w:r>
+        <w:t xml:space="preserve"> rate for rotations around x, y and z. In our case since the velocities are relative to the robot frame when we are in forward motion we set the x velocity to </w:t>
+      </w:r>
+      <w:proofErr w:type="spellStart"/>
+      <w:r>
+        <w:t>velMax</w:t>
+      </w:r>
+      <w:proofErr w:type="spellEnd"/>
+      <w:r>
+        <w:t xml:space="preserve"> variable value (that is set by the YAML file) and all other velocities and angular rates are set to zero, when we are in rotation state the z angular rate is set to </w:t>
+      </w:r>
+      <w:proofErr w:type="spellStart"/>
+      <w:r>
+        <w:t>velAngMax</w:t>
+      </w:r>
+      <w:proofErr w:type="spellEnd"/>
+      <w:r>
+        <w:t xml:space="preserve"> variable valu</w:t>
+      </w:r>
+      <w:r>
+        <w:t>e</w:t>
+      </w:r>
+      <w:r>
+        <w:t xml:space="preserve"> (that is set by the YAML file) and all other velocities and angular rates are set to zero.</w:t>
+      </w:r>
+    </w:p>
+    <w:p>
+      <w:r>
+        <w:rPr>
+          <w:lang w:val="en-GB"/>
+        </w:rPr>
+        <w:t>During simulation a s</w:t>
+      </w:r>
+      <w:r>
+        <w:rPr>
+          <w:lang w:val="en-GB"/>
+        </w:rPr>
+        <w:t>ub</w:t>
+      </w:r>
+      <w:r>
+        <w:rPr>
+          <w:lang w:val="en-GB"/>
+        </w:rPr>
+        <w:t xml:space="preserve">scription to </w:t>
+      </w:r>
+      <w:r>
+        <w:rPr>
+          <w:lang w:val="en-GB"/>
+        </w:rPr>
+        <w:t>/</w:t>
+      </w:r>
+      <w:proofErr w:type="spellStart"/>
+      <w:r>
+        <w:rPr>
+          <w:lang w:val="en-GB"/>
+        </w:rPr>
+        <w:t>ground_thruth</w:t>
+      </w:r>
+      <w:proofErr w:type="spellEnd"/>
+      <w:r>
+        <w:rPr>
+          <w:lang w:val="en-GB"/>
+        </w:rPr>
         <w:t xml:space="preserve"> </w:t>
       </w:r>
       <w:r>
-        <w:t>type message.</w:t>
-      </w:r>
-      <w:r>
-        <w:t xml:space="preserve"> </w:t>
-      </w:r>
-      <w:r>
-        <w:rPr>
-          <w:lang w:val="en-GB"/>
-        </w:rPr>
-        <w:t>This message contains various data</w:t>
-      </w:r>
-      <w:r>
-        <w:rPr>
-          <w:lang w:val="en-GB"/>
-        </w:rPr>
+        <w:rPr>
+          <w:lang w:val="en-GB"/>
+        </w:rPr>
+        <w:t xml:space="preserve">topic is used to get </w:t>
+      </w:r>
+      <w:proofErr w:type="spellStart"/>
+      <w:r>
+        <w:t>nav_msgs</w:t>
+      </w:r>
+      <w:proofErr w:type="spellEnd"/>
+      <w:r>
+        <w:t>/</w:t>
+      </w:r>
+      <w:r>
+        <w:t xml:space="preserve">msg </w:t>
+      </w:r>
+      <w:r>
+        <w:t>/</w:t>
+      </w:r>
+      <w:r>
+        <w:t>Odometry</w:t>
+      </w:r>
+      <w:r>
+        <w:t xml:space="preserve"> message type. The odometry message contains the pose message, in this the real position of the robot is present, the real position is retrieved for the simulation environment therefore in future real world robot implementation cannot be used. The position retrieved from </w:t>
+      </w:r>
+      <w:proofErr w:type="spellStart"/>
+      <w:r>
+        <w:t>ground_thrut</w:t>
+      </w:r>
+      <w:proofErr w:type="spellEnd"/>
+      <w:r>
+        <w:t xml:space="preserve"> topic</w:t>
+      </w:r>
+      <w:r>
+        <w:t xml:space="preserve"> is used</w:t>
+      </w:r>
+      <w:r>
+        <w:t xml:space="preserve"> in </w:t>
+      </w:r>
+      <w:proofErr w:type="spellStart"/>
+      <w:proofErr w:type="gramStart"/>
+      <w:r>
+        <w:t>groundTruthCallback</w:t>
+      </w:r>
+      <w:proofErr w:type="spellEnd"/>
+      <w:r>
+        <w:t>(</w:t>
+      </w:r>
+      <w:proofErr w:type="gramEnd"/>
+      <w:r>
+        <w:t>) method</w:t>
+      </w:r>
+      <w:r>
+        <w:t xml:space="preserve"> to compare estimated position with actual one</w:t>
+      </w:r>
+      <w:r>
         <w:t xml:space="preserve">, </w:t>
       </w:r>
       <w:r>
-        <w:t>angle_min</w:t>
-      </w:r>
-      <w:r>
-        <w:t xml:space="preserve">, </w:t>
-      </w:r>
-      <w:r>
-        <w:t>angle_max</w:t>
-      </w:r>
-      <w:r>
-        <w:t xml:space="preserve"> </w:t>
-      </w:r>
-      <w:r>
-        <w:t xml:space="preserve">and </w:t>
-      </w:r>
-      <w:r>
-        <w:t>angle_increment</w:t>
-      </w:r>
-      <w:r>
-        <w:rPr>
-          <w:lang w:val="en-GB"/>
-        </w:rPr>
-        <w:t xml:space="preserve"> </w:t>
-      </w:r>
-      <w:r>
-        <w:rPr>
-          <w:lang w:val="en-GB"/>
-        </w:rPr>
-        <w:t xml:space="preserve">are respectively </w:t>
-      </w:r>
-      <w:r>
-        <w:rPr>
-          <w:lang w:val="en-GB"/>
-        </w:rPr>
-        <w:t>start</w:t>
-      </w:r>
-      <w:r>
-        <w:rPr>
-          <w:lang w:val="en-GB"/>
-        </w:rPr>
-        <w:t xml:space="preserve"> angle of scan, end angle of scan and angle increment between each Lidar </w:t>
-      </w:r>
-      <w:r>
-        <w:rPr>
-          <w:lang w:val="en-GB"/>
-        </w:rPr>
-        <w:t>ray, range</w:t>
-      </w:r>
-      <w:r>
-        <w:t>_</w:t>
-      </w:r>
-      <w:r>
-        <w:t xml:space="preserve">min and </w:t>
-      </w:r>
-      <w:r>
-        <w:t>range_max</w:t>
-      </w:r>
-      <w:r>
-        <w:t xml:space="preserve"> are </w:t>
-      </w:r>
-      <w:r>
-        <w:t>minimum </w:t>
-      </w:r>
-      <w:r>
-        <w:t xml:space="preserve">and maximum </w:t>
-      </w:r>
-      <w:r>
-        <w:t>range value</w:t>
-      </w:r>
-      <w:r>
-        <w:t>, the ra</w:t>
-      </w:r>
-      <w:r>
-        <w:t>n</w:t>
-      </w:r>
-      <w:r>
-        <w:t xml:space="preserve">ges data are </w:t>
-      </w:r>
-      <w:r>
-        <w:t>contained</w:t>
-      </w:r>
-      <w:r>
-        <w:t xml:space="preserve"> in </w:t>
-      </w:r>
-      <w:r>
-        <w:t>ranges</w:t>
-      </w:r>
-      <w:r>
-        <w:t xml:space="preserve">[] vector, a vector of float that contains </w:t>
-      </w:r>
-      <w:r>
-        <w:t>easement</w:t>
-      </w:r>
-      <w:r>
-        <w:t xml:space="preserve"> for eac</w:t>
-      </w:r>
-      <w:r>
-        <w:t>h</w:t>
-      </w:r>
-      <w:r>
-        <w:t xml:space="preserve"> angle, this vector has </w:t>
-      </w:r>
-      <w:r>
-        <w:t xml:space="preserve">a variable length and therefore </w:t>
-      </w:r>
-      <w:r>
-        <w:t>angle_min</w:t>
-      </w:r>
-      <w:r>
-        <w:t xml:space="preserve">, </w:t>
-      </w:r>
-      <w:r>
-        <w:t xml:space="preserve">angle_max </w:t>
-      </w:r>
-      <w:r>
-        <w:t xml:space="preserve">and </w:t>
-      </w:r>
-      <w:r>
-        <w:t>angle_increment</w:t>
-      </w:r>
-      <w:r>
-        <w:t xml:space="preserve"> have to be used to treat </w:t>
-      </w:r>
-      <w:r>
-        <w:t xml:space="preserve">with </w:t>
-      </w:r>
-      <w:r>
-        <w:t>it.</w:t>
-      </w:r>
-    </w:p>
-    <w:p>
-      <w:r>
-        <w:rPr>
-          <w:lang w:val="en-GB"/>
-        </w:rPr>
-        <w:t xml:space="preserve">For each Lidar scan </w:t>
-      </w:r>
-      <w:r>
-        <w:rPr>
-          <w:lang w:val="en-GB"/>
-        </w:rPr>
-        <w:t>a dedicated callback</w:t>
-      </w:r>
-      <w:r>
-        <w:rPr>
-          <w:lang w:val="en-GB"/>
-        </w:rPr>
-        <w:t xml:space="preserve"> method </w:t>
-      </w:r>
-      <w:r>
-        <w:t>LidarCallback</w:t>
-      </w:r>
-      <w:r>
-        <w:t>()</w:t>
-      </w:r>
-      <w:r>
-        <w:rPr>
-          <w:lang w:val="en-GB"/>
-        </w:rPr>
-        <w:t xml:space="preserve"> processes the raw sensor data. To account for measurement noise and out-of-bounds readings, the recorded distance arrays are </w:t>
-      </w:r>
-      <w:r>
-        <w:rPr>
-          <w:lang w:val="en-GB"/>
-        </w:rPr>
-        <w:t>pre-processed</w:t>
-      </w:r>
-      <w:r>
-        <w:rPr>
-          <w:lang w:val="en-GB"/>
-        </w:rPr>
-        <w:t xml:space="preserve"> by capping the values to the sensor's reliable minimum and maximum limits</w:t>
-      </w:r>
-      <w:r>
-        <w:rPr>
-          <w:lang w:val="en-GB"/>
-        </w:rPr>
-        <w:t xml:space="preserve"> (</w:t>
-      </w:r>
-      <w:r>
-        <w:t>range_m</w:t>
-      </w:r>
-      <w:r>
-        <w:t xml:space="preserve">in and </w:t>
-      </w:r>
-      <w:r>
-        <w:t>range_max</w:t>
-      </w:r>
-      <w:r>
-        <w:t xml:space="preserve"> values)</w:t>
-      </w:r>
-      <w:r>
-        <w:rPr>
-          <w:lang w:val="en-GB"/>
-        </w:rPr>
-        <w:t xml:space="preserve">. </w:t>
-      </w:r>
-      <w:r>
-        <w:rPr>
-          <w:lang w:val="en-GB"/>
-        </w:rPr>
-        <w:t xml:space="preserve">The conditioned data is then passed </w:t>
-      </w:r>
-      <w:r>
-        <w:rPr>
-          <w:lang w:val="en-GB"/>
-        </w:rPr>
-        <w:t>to moving</w:t>
-      </w:r>
-      <w:r>
-        <w:rPr>
-          <w:lang w:val="en-GB"/>
-        </w:rPr>
-        <w:t>()</w:t>
-      </w:r>
-      <w:r>
-        <w:rPr>
-          <w:lang w:val="en-GB"/>
-        </w:rPr>
-        <w:t xml:space="preserve"> method, which dictates the robot's kinematic behaviour.</w:t>
-      </w:r>
-      <w:r>
-        <w:rPr>
-          <w:lang w:val="en-GB"/>
-        </w:rPr>
-        <w:t xml:space="preserve"> </w:t>
-      </w:r>
-      <w:r>
-        <w:rPr>
-          <w:lang w:val="en-GB"/>
-        </w:rPr>
-        <w:t>In the forward motion state, the controller extracts a 10-degree</w:t>
-      </w:r>
-      <w:r>
-        <w:rPr>
-          <w:lang w:val="en-GB"/>
-        </w:rPr>
-        <w:t xml:space="preserve"> </w:t>
-      </w:r>
-      <w:r>
-        <w:rPr>
-          <w:lang w:val="en-GB"/>
-        </w:rPr>
-        <w:t xml:space="preserve">field of view </w:t>
-      </w:r>
-      <w:r>
-        <w:rPr>
-          <w:lang w:val="en-GB"/>
-        </w:rPr>
-        <w:t xml:space="preserve">(calculated through </w:t>
-      </w:r>
-      <w:r>
-        <w:rPr>
-          <w:lang w:val="en-GB"/>
-        </w:rPr>
-        <w:t>angle_increment</w:t>
-      </w:r>
-      <w:r>
-        <w:rPr>
-          <w:lang w:val="en-GB"/>
-        </w:rPr>
-        <w:t xml:space="preserve"> value</w:t>
-      </w:r>
-      <w:r>
-        <w:rPr>
-          <w:lang w:val="en-GB"/>
-        </w:rPr>
-        <w:t xml:space="preserve"> given in scan message</w:t>
-      </w:r>
-      <w:r>
-        <w:rPr>
-          <w:lang w:val="en-GB"/>
-        </w:rPr>
-        <w:t>)</w:t>
-      </w:r>
-      <w:r>
-        <w:rPr>
-          <w:lang w:val="en-GB"/>
-        </w:rPr>
-        <w:t xml:space="preserve"> directly in front of the robot. A median filter is applied to this subset to reject Gaussian noise and prevent false obstacle detection. If the evaluated frontal distance falls below the established safety threshold, the robot halts and triggers the turning sequence</w:t>
-      </w:r>
-      <w:r>
-        <w:rPr>
-          <w:lang w:val="en-GB"/>
-        </w:rPr>
-        <w:t xml:space="preserve">, the turning section will </w:t>
-      </w:r>
-      <w:r>
-        <w:rPr>
-          <w:lang w:val="en-GB"/>
-        </w:rPr>
-        <w:t>start as the next Laserscan message arrives</w:t>
-      </w:r>
-      <w:r>
-        <w:rPr>
-          <w:lang w:val="en-GB"/>
-        </w:rPr>
-        <w:t>. Otherwise, it maintains its forward trajectory.</w:t>
-      </w:r>
-    </w:p>
-    <w:p>
-      <w:pPr>
-        <w:rPr>
-          <w:lang w:val="en-GB"/>
-        </w:rPr>
-      </w:pPr>
-      <w:r>
-        <w:rPr>
-          <w:lang w:val="en-GB"/>
-        </w:rPr>
-        <w:t xml:space="preserve">In case of the robot being under the threshold distance the rotation phase starts. </w:t>
-      </w:r>
-      <w:r>
-        <w:t>Initially, the direction of rotation must be determined,</w:t>
-      </w:r>
-      <w:r>
-        <w:t xml:space="preserve"> </w:t>
-      </w:r>
-      <w:r>
-        <w:rPr>
-          <w:lang w:val="en-GB"/>
-        </w:rPr>
-        <w:t>due to variability of the dimension of the lidars scan ranges vector the +90 and -90 degree direction are evaluated dynamically, the 25% (for +90) and the 75%</w:t>
-      </w:r>
-      <w:r>
-        <w:rPr>
-          <w:lang w:val="en-GB"/>
-        </w:rPr>
-        <w:t xml:space="preserve"> </w:t>
-      </w:r>
-      <w:r>
-        <w:rPr>
-          <w:lang w:val="en-GB"/>
-        </w:rPr>
-        <w:t xml:space="preserve">(for -90) index position of the ranges vector are taken in account, from there we take a range of 10 degrees for both, remove gaussian error with a median, the direction of movement is detected by the maximum possible space between the two. </w:t>
-      </w:r>
-    </w:p>
-    <w:p>
-      <w:r>
-        <w:rPr>
-          <w:lang w:val="en-GB"/>
-        </w:rPr>
-        <w:t>From /odom topic</w:t>
-      </w:r>
-      <w:r>
-        <w:rPr>
-          <w:lang w:val="en-GB"/>
-        </w:rPr>
-        <w:t xml:space="preserve"> subscription</w:t>
-      </w:r>
-      <w:r>
-        <w:rPr>
-          <w:lang w:val="en-GB"/>
-        </w:rPr>
-        <w:t xml:space="preserve"> the message </w:t>
-      </w:r>
-      <w:r>
-        <w:t>nav_msgs</w:t>
-      </w:r>
-      <w:r>
-        <w:t>/</w:t>
-      </w:r>
-      <w:r>
-        <w:t xml:space="preserve">msg </w:t>
-      </w:r>
-      <w:r>
-        <w:t>/</w:t>
-      </w:r>
-      <w:r>
-        <w:t>Odometry</w:t>
-      </w:r>
-      <w:r>
-        <w:t xml:space="preserve"> is retrieved, this message contains pose and twists message, the pose message </w:t>
-      </w:r>
-      <w:r>
-        <w:t>estimates</w:t>
-      </w:r>
-      <w:r>
-        <w:t xml:space="preserve"> robot position and </w:t>
-      </w:r>
-      <w:r>
-        <w:t>orientation.</w:t>
-      </w:r>
-      <w:r>
-        <w:t xml:space="preserve"> The </w:t>
-      </w:r>
-      <w:r>
-        <w:t>odomCallback</w:t>
-      </w:r>
-      <w:r>
-        <w:t>()</w:t>
-      </w:r>
-      <w:r>
-        <w:t xml:space="preserve"> callback method </w:t>
-      </w:r>
-      <w:r>
-        <w:t>extracts the quaternion of robot’s current pose</w:t>
-      </w:r>
-      <w:r>
-        <w:t>, with a prebuilt function is possible to convert it in Euler angles and get the yaw angle (</w:t>
-      </w:r>
-      <w:r>
-        <w:t>current_yaw</w:t>
-      </w:r>
-      <w:r>
-        <w:t>) for algorithm porpoises.</w:t>
-      </w:r>
-    </w:p>
-    <w:p>
-      <w:pPr>
-        <w:rPr>
-          <w:lang w:val="en-GB"/>
-        </w:rPr>
-      </w:pPr>
-      <w:r>
-        <w:rPr>
-          <w:lang w:val="en-GB"/>
-        </w:rPr>
-        <w:t>The target yaw is calculated</w:t>
-      </w:r>
-      <w:r>
-        <w:rPr>
-          <w:lang w:val="en-GB"/>
-        </w:rPr>
-        <w:t xml:space="preserve"> starting from current_yaw and adding the previous calculated rotation angle to get </w:t>
-      </w:r>
-      <w:r>
-        <w:rPr>
-          <w:lang w:val="en-GB"/>
-        </w:rPr>
-        <w:t>final direction.</w:t>
-      </w:r>
-    </w:p>
-    <w:p>
-      <w:pPr>
-        <w:rPr>
-          <w:lang w:val="en-GB"/>
-        </w:rPr>
-      </w:pPr>
-      <w:r>
-        <w:rPr>
-          <w:lang w:val="en-GB"/>
-        </w:rPr>
-        <w:t>The actual rotation starts after the next laser scan, a proportional controller is implemented taking in account the error calculated by subtracting desired yaw</w:t>
-      </w:r>
-      <w:r>
-        <w:rPr>
-          <w:lang w:val="en-GB"/>
-        </w:rPr>
-        <w:t xml:space="preserve"> </w:t>
-      </w:r>
-      <w:r>
-        <w:rPr>
-          <w:lang w:val="en-GB"/>
-        </w:rPr>
-        <w:t>(previously normalized) and the current yaw (retrieved by odom topic read), the Kp is chosen and 0.5 of to ensure a smooth rotation and the target angle can be reached with a 0.02 rad of error.</w:t>
-      </w:r>
-    </w:p>
-    <w:p>
-      <w:pPr>
-        <w:rPr>
-          <w:lang w:val="en-GB"/>
-        </w:rPr>
-      </w:pPr>
-      <w:r>
-        <w:rPr>
-          <w:lang w:val="en-GB"/>
-        </w:rPr>
-        <w:t>After the rotation the robot returns in the forward motion state and starts to move in the new direction.</w:t>
-      </w:r>
-    </w:p>
-    <w:p>
-      <w:r>
-        <w:rPr>
-          <w:lang w:val="en-GB"/>
-        </w:rPr>
-        <w:t>The actual movement</w:t>
-      </w:r>
-      <w:r>
-        <w:rPr>
-          <w:lang w:val="en-GB"/>
-        </w:rPr>
-        <w:t xml:space="preserve"> commands are sent through the /cmd_vel topic, in </w:t>
-      </w:r>
-      <w:r>
-        <w:t>geometry_msgs</w:t>
-      </w:r>
-      <w:r>
-        <w:t>/</w:t>
-      </w:r>
-      <w:r>
-        <w:t>msg</w:t>
-      </w:r>
-      <w:r>
-        <w:t>/</w:t>
-      </w:r>
-      <w:r>
-        <w:t>Twist</w:t>
-      </w:r>
-      <w:r>
-        <w:t xml:space="preserve"> type message. This message accepts 2 </w:t>
-      </w:r>
-      <w:r>
-        <w:t>vectors</w:t>
-      </w:r>
-      <w:r>
-        <w:t xml:space="preserve"> of dimension 3, in the first message the liner velocity is specified for x, y and z, and the </w:t>
-      </w:r>
-      <w:r>
-        <w:t>angular</w:t>
-      </w:r>
-      <w:r>
-        <w:t xml:space="preserve"> rate for rotations around x, y and z. In our case since the velocities are relative to the robot frame when we are in forward motion we set the x velocity to </w:t>
-      </w:r>
-      <w:r>
-        <w:t>velMax</w:t>
-      </w:r>
-      <w:r>
-        <w:t xml:space="preserve"> variable</w:t>
-      </w:r>
-      <w:r>
-        <w:t xml:space="preserve"> value (that is set by the YAML file) and all other velocities and angular rates are set to zero, when we are in rotation state the</w:t>
-      </w:r>
-      <w:r>
-        <w:t xml:space="preserve"> </w:t>
-      </w:r>
-      <w:r>
-        <w:t>z</w:t>
-      </w:r>
-      <w:r>
-        <w:t xml:space="preserve"> </w:t>
-      </w:r>
-      <w:r>
-        <w:t>angular rate is set</w:t>
-      </w:r>
-      <w:r>
-        <w:t xml:space="preserve"> to </w:t>
-      </w:r>
-      <w:r>
-        <w:t>velAngMax</w:t>
-      </w:r>
-      <w:r>
-        <w:t xml:space="preserve"> variable </w:t>
-      </w:r>
-      <w:r>
-        <w:t>valu</w:t>
-      </w:r>
-      <w:r>
-        <w:t>e</w:t>
-      </w:r>
-      <w:r>
-        <w:t xml:space="preserve"> </w:t>
-      </w:r>
-      <w:r>
-        <w:t>(that is set by the YAML file) and all other velocities and angular rates are set to zero</w:t>
+        <w:t>to check the positioning error accumulated by the differential drive odometry system, which could influence the performance of</w:t>
+      </w:r>
+      <w:r>
+        <w:t xml:space="preserve"> the</w:t>
+      </w:r>
+      <w:r>
+        <w:t xml:space="preserve"> control algorithm</w:t>
       </w:r>
       <w:r>
         <w:t>.</w:t>
       </w:r>
     </w:p>
     <w:p>
-      <w:r>
-        <w:rPr>
-          <w:lang w:val="en-GB"/>
-        </w:rPr>
-        <w:t>During simulation a s</w:t>
-      </w:r>
-      <w:r>
-        <w:rPr>
-          <w:lang w:val="en-GB"/>
-        </w:rPr>
-        <w:t>ub</w:t>
-      </w:r>
-      <w:r>
-        <w:rPr>
-          <w:lang w:val="en-GB"/>
-        </w:rPr>
-        <w:t xml:space="preserve">scription to </w:t>
-      </w:r>
-      <w:r>
-        <w:rPr>
-          <w:lang w:val="en-GB"/>
-        </w:rPr>
-        <w:t>/</w:t>
-      </w:r>
-      <w:r>
-        <w:rPr>
-          <w:lang w:val="en-GB"/>
-        </w:rPr>
-        <w:t xml:space="preserve">ground_thruth </w:t>
-      </w:r>
-      <w:r>
-        <w:rPr>
-          <w:lang w:val="en-GB"/>
-        </w:rPr>
-        <w:t xml:space="preserve">topic is used to get </w:t>
-      </w:r>
-      <w:r>
-        <w:t>nav_msgs</w:t>
-      </w:r>
-      <w:r>
-        <w:t>/</w:t>
-      </w:r>
-      <w:r>
-        <w:t xml:space="preserve">msg </w:t>
-      </w:r>
-      <w:r>
-        <w:t>/</w:t>
-      </w:r>
-      <w:r>
-        <w:t>Odometry</w:t>
-      </w:r>
-      <w:r>
-        <w:t xml:space="preserve"> message type. The odometry message contains </w:t>
-      </w:r>
-      <w:r>
-        <w:t>the pose message</w:t>
-      </w:r>
-      <w:r>
-        <w:t>, in this the real position of the robot is present, the real position is retrieved for the simulation environment therefore in future real world robot implementation cannot be used. The position retrieved from ground_thrut</w:t>
-      </w:r>
-      <w:r>
-        <w:t xml:space="preserve"> topic</w:t>
-      </w:r>
-      <w:r>
-        <w:t xml:space="preserve"> is used</w:t>
-      </w:r>
-      <w:r>
-        <w:t xml:space="preserve"> in </w:t>
-      </w:r>
-      <w:r>
-        <w:t>groundTruthCallback</w:t>
-      </w:r>
-      <w:r>
-        <w:t>() method</w:t>
-      </w:r>
-      <w:r>
-        <w:t xml:space="preserve"> to compare estimated position with actual one</w:t>
-      </w:r>
-      <w:r>
-        <w:t xml:space="preserve">, </w:t>
-      </w:r>
-      <w:r>
-        <w:t>to check the positioning error accumulated by the differential drive odometry system, which could influence the performance of</w:t>
-      </w:r>
-      <w:r>
-        <w:t xml:space="preserve"> the</w:t>
-      </w:r>
-      <w:r>
-        <w:t xml:space="preserve"> control algorithm</w:t>
-      </w:r>
-      <w:r>
-        <w:t>.</w:t>
-      </w:r>
-    </w:p>
-    <w:p>
-      <w:pPr>
-        <w:pStyle w:val="Heading2"/>
+      <w:pPr>
+        <w:pStyle w:val="Titolo2"/>
       </w:pPr>
       <w:r>
         <w:lastRenderedPageBreak/>
@@ -2293,25 +2556,41 @@
         </w:rPr>
         <w:t xml:space="preserve"> </w:t>
       </w:r>
+      <w:proofErr w:type="spellStart"/>
       <w:r>
         <w:rPr>
           <w:lang w:val="en-GB"/>
         </w:rPr>
         <w:t>groud_thruth</w:t>
       </w:r>
-    </w:p>
-    <w:p>
-      <w:pPr>
-        <w:ind w:firstLine="0"/>
-        <w:rPr>
-          <w:lang w:val="en-GB"/>
-        </w:rPr>
-      </w:pPr>
-      <w:r>
-        <w:rPr>
-          <w:lang w:val="en-GB"/>
-        </w:rPr>
-        <w:t xml:space="preserve">    Ground_thruth topic subscription was removed since in real world environment only odometry estimation of position is possible.</w:t>
+      <w:proofErr w:type="spellEnd"/>
+    </w:p>
+    <w:p>
+      <w:pPr>
+        <w:ind w:firstLine="0"/>
+        <w:rPr>
+          <w:lang w:val="en-GB"/>
+        </w:rPr>
+      </w:pPr>
+      <w:r>
+        <w:rPr>
+          <w:lang w:val="en-GB"/>
+        </w:rPr>
+        <w:t xml:space="preserve">    </w:t>
+      </w:r>
+      <w:proofErr w:type="spellStart"/>
+      <w:r>
+        <w:rPr>
+          <w:lang w:val="en-GB"/>
+        </w:rPr>
+        <w:t>Ground_thruth</w:t>
+      </w:r>
+      <w:proofErr w:type="spellEnd"/>
+      <w:r>
+        <w:rPr>
+          <w:lang w:val="en-GB"/>
+        </w:rPr>
+        <w:t xml:space="preserve"> topic subscription was removed since in real world environment only odometry estimation of position is possible.</w:t>
       </w:r>
       <w:r>
         <w:rPr>
@@ -2348,9 +2627,11 @@
         </w:rPr>
         <w:t xml:space="preserve">  </w:t>
       </w:r>
+      <w:proofErr w:type="spellStart"/>
       <w:r>
         <w:t>qos_profile_sensor_data</w:t>
       </w:r>
+      <w:proofErr w:type="spellEnd"/>
       <w:r>
         <w:t xml:space="preserve"> quality of service</w:t>
       </w:r>
@@ -2449,7 +2730,15 @@
         <w:ind w:firstLine="0"/>
       </w:pPr>
       <w:r>
-        <w:t xml:space="preserve">    Launch file was modified to remove simulation launch file call that is not needed in the real world application.</w:t>
+        <w:t xml:space="preserve">    Launch file was modified to remove simulation launch file call that is not needed in the </w:t>
+      </w:r>
+      <w:proofErr w:type="gramStart"/>
+      <w:r>
+        <w:t>real world</w:t>
+      </w:r>
+      <w:proofErr w:type="gramEnd"/>
+      <w:r>
+        <w:t xml:space="preserve"> application.</w:t>
       </w:r>
     </w:p>
     <w:p>
@@ -2470,11 +2759,19 @@
         </w:rPr>
         <w:t xml:space="preserve">This adjustment </w:t>
       </w:r>
-      <w:r>
-        <w:rPr>
-          <w:lang w:val="en-GB"/>
-        </w:rPr>
-        <w:t>preserve the controller architecture while adapting sensing, communication and motion parameters to the behaviour of the real Turtlebot3.</w:t>
+      <w:proofErr w:type="gramStart"/>
+      <w:r>
+        <w:rPr>
+          <w:lang w:val="en-GB"/>
+        </w:rPr>
+        <w:t>preserve</w:t>
+      </w:r>
+      <w:proofErr w:type="gramEnd"/>
+      <w:r>
+        <w:rPr>
+          <w:lang w:val="en-GB"/>
+        </w:rPr>
+        <w:t xml:space="preserve"> the controller architecture while adapting sensing, communication and motion parameters to the behaviour of the real Turtlebot3.</w:t>
       </w:r>
     </w:p>
     <w:p>
@@ -2488,61 +2785,314 @@
     <w:p/>
     <w:p>
       <w:pPr>
-        <w:pStyle w:val="Heading1"/>
+        <w:pStyle w:val="Titolo1"/>
       </w:pPr>
       <w:r>
         <w:t>Experiment and Results</w:t>
       </w:r>
     </w:p>
     <w:p>
-      <w:r>
-        <w:t xml:space="preserve">Describe here the experiments </w:t>
-      </w:r>
-      <w:r>
-        <w:t xml:space="preserve">you conducted and present the results </w:t>
-      </w:r>
-      <w:r>
-        <w:t>providing clear and meaningful comments. You can insert here plot</w:t>
-      </w:r>
-      <w:r>
-        <w:t>, tables and whatever image you find useful to present your experimental setup and</w:t>
-      </w:r>
-      <w:r>
-        <w:t xml:space="preserve"> the results.</w:t>
-      </w:r>
-    </w:p>
-    <w:p>
-      <w:r>
-        <w:t xml:space="preserve">You can divide this section </w:t>
-      </w:r>
-      <w:r>
-        <w:t>into</w:t>
-      </w:r>
-      <w:r>
-        <w:t xml:space="preserve"> Simulation and Real Robot if you find it useful.</w:t>
+      <w:pPr>
+        <w:pStyle w:val="Titolo2"/>
+      </w:pPr>
+      <w:r>
+        <w:t>Simulation</w:t>
+      </w:r>
+    </w:p>
+    <w:p>
+      <w:pPr>
+        <w:ind w:firstLine="0"/>
+      </w:pPr>
+      <w:r>
+        <w:t xml:space="preserve">To run the </w:t>
+      </w:r>
+      <w:proofErr w:type="gramStart"/>
+      <w:r>
+        <w:t>simulations</w:t>
+      </w:r>
+      <w:proofErr w:type="gramEnd"/>
+      <w:r>
+        <w:t xml:space="preserve"> we had to launch the following commands:</w:t>
+      </w:r>
+    </w:p>
+    <w:p>
+      <w:pPr>
+        <w:ind w:firstLine="0"/>
+      </w:pPr>
+      <w:r>
+        <w:t>1. source ./install/</w:t>
+      </w:r>
+      <w:proofErr w:type="spellStart"/>
+      <w:r>
+        <w:t>setup.bash</w:t>
+      </w:r>
+      <w:proofErr w:type="spellEnd"/>
+      <w:r>
+        <w:t xml:space="preserve"> (to source the local workspace), </w:t>
+      </w:r>
+    </w:p>
+    <w:p>
+      <w:pPr>
+        <w:ind w:firstLine="0"/>
+      </w:pPr>
+      <w:r>
+        <w:t>2.</w:t>
       </w:r>
       <w:r>
         <w:t xml:space="preserve"> </w:t>
       </w:r>
-    </w:p>
-    <w:p>
-      <w:pPr>
-        <w:pStyle w:val="Heading2"/>
-      </w:pPr>
-      <w:r>
-        <w:t>Simulation</w:t>
-      </w:r>
-    </w:p>
-    <w:p>
-      <w:r>
-        <w:t>…</w:t>
-      </w:r>
-    </w:p>
-    <w:p>
-      <w:pPr>
-        <w:pStyle w:val="Heading2"/>
-      </w:pPr>
-      <w:r>
+      <w:r>
+        <w:t>export TURTLEBOT3_MODEL=burger (to set the Turtlebot3 model),</w:t>
+      </w:r>
+    </w:p>
+    <w:p>
+      <w:pPr>
+        <w:ind w:firstLine="0"/>
+      </w:pPr>
+      <w:r>
+        <w:t>3. ros2 launch turtlebot3_gazebo lab02.launch.py (to run the simulation)</w:t>
+      </w:r>
+    </w:p>
+    <w:p>
+      <w:pPr>
+        <w:ind w:firstLine="0"/>
+      </w:pPr>
+    </w:p>
+    <w:p>
+      <w:pPr>
+        <w:ind w:firstLine="0"/>
+        <w:rPr>
+          <w:noProof/>
+        </w:rPr>
+      </w:pPr>
+      <w:r>
+        <w:t xml:space="preserve">As described in the architecture section, the simulation experiments aimed to validate the finite state logic (FORWARD and TURNING) within the Gazebo environment, utilizing RViz 2 for </w:t>
+      </w:r>
+      <w:r>
+        <w:t>visualization.</w:t>
+      </w:r>
+      <w:r>
+        <w:rPr>
+          <w:noProof/>
+        </w:rPr>
+        <w:t xml:space="preserve"> </w:t>
+      </w:r>
+    </w:p>
+    <w:p>
+      <w:pPr>
+        <w:ind w:firstLine="0"/>
+        <w:rPr>
+          <w:noProof/>
+        </w:rPr>
+      </w:pPr>
+      <w:r>
+        <w:rPr>
+          <w:noProof/>
+        </w:rPr>
+        <w:t>In this ideal phase, the pre-processing of LiDAR data via clipping to physical limits (range_min and range_max) and the application of a median filter on the 10-degree frontal field of view ensured the total rejection of Gaussian noise, preventing the detection of phantom obstacles.</w:t>
+      </w:r>
+    </w:p>
+    <w:p>
+      <w:pPr>
+        <w:ind w:firstLine="0"/>
+      </w:pPr>
+      <w:r>
+        <w:rPr>
+          <w:noProof/>
+        </w:rPr>
+        <w:drawing>
+          <wp:inline distT="0" distB="0" distL="0" distR="0" wp14:anchorId="551BF0A5" wp14:editId="2F4E8A0B">
+            <wp:extent cx="2801646" cy="2091267"/>
+            <wp:effectExtent l="0" t="0" r="0" b="4445"/>
+            <wp:docPr id="1437862916" name="Immagine 2" descr="The image shows a simple, abstract digital representation with a grid layout, featuring a blue square, a green circle, and a red light source.&#10;&#10;Il contenuto generato dall'IA potrebbe non essere corretto."/>
+            <wp:cNvGraphicFramePr>
+              <a:graphicFrameLocks xmlns:a="http://schemas.openxmlformats.org/drawingml/2006/main" noChangeAspect="1"/>
+            </wp:cNvGraphicFramePr>
+            <a:graphic xmlns:a="http://schemas.openxmlformats.org/drawingml/2006/main">
+              <a:graphicData uri="http://schemas.openxmlformats.org/drawingml/2006/picture">
+                <pic:pic xmlns:pic="http://schemas.openxmlformats.org/drawingml/2006/picture">
+                  <pic:nvPicPr>
+                    <pic:cNvPr id="1437862916" name="Immagine 2" descr="The image shows a simple, abstract digital representation with a grid layout, featuring a blue square, a green circle, and a red light source.&#10;&#10;Il contenuto generato dall'IA potrebbe non essere corretto."/>
+                    <pic:cNvPicPr>
+                      <a:picLocks noChangeAspect="1" noChangeArrowheads="1"/>
+                    </pic:cNvPicPr>
+                  </pic:nvPicPr>
+                  <pic:blipFill>
+                    <a:blip r:embed="rId11" cstate="print">
+                      <a:extLst>
+                        <a:ext uri="{28A0092B-C50C-407E-A947-70E740481C1C}">
+                          <a14:useLocalDpi xmlns:a14="http://schemas.microsoft.com/office/drawing/2010/main" val="0"/>
+                        </a:ext>
+                      </a:extLst>
+                    </a:blip>
+                    <a:srcRect/>
+                    <a:stretch>
+                      <a:fillRect/>
+                    </a:stretch>
+                  </pic:blipFill>
+                  <pic:spPr bwMode="auto">
+                    <a:xfrm>
+                      <a:off x="0" y="0"/>
+                      <a:ext cx="2808304" cy="2096237"/>
+                    </a:xfrm>
+                    <a:prstGeom prst="rect">
+                      <a:avLst/>
+                    </a:prstGeom>
+                    <a:noFill/>
+                    <a:ln>
+                      <a:noFill/>
+                    </a:ln>
+                  </pic:spPr>
+                </pic:pic>
+              </a:graphicData>
+            </a:graphic>
+          </wp:inline>
+        </w:drawing>
+      </w:r>
+    </w:p>
+    <w:p>
+      <w:pPr>
+        <w:ind w:firstLine="0"/>
+      </w:pPr>
+    </w:p>
+    <w:p>
+      <w:pPr>
+        <w:ind w:firstLine="0"/>
+      </w:pPr>
+      <w:r>
+        <w:t>Real Robot:</w:t>
+      </w:r>
+    </w:p>
+    <w:p>
+      <w:pPr>
+        <w:ind w:firstLine="0"/>
+      </w:pPr>
+    </w:p>
+    <w:p>
+      <w:pPr>
+        <w:ind w:firstLine="0"/>
+      </w:pPr>
+      <w:r>
+        <w:t xml:space="preserve">The test on the physical robot confirmed the validity of the adaptations described in Task 2. The transition from static array indexing to a dynamic calculation based on the </w:t>
+      </w:r>
+      <w:proofErr w:type="spellStart"/>
+      <w:r>
+        <w:t>angle_min</w:t>
+      </w:r>
+      <w:proofErr w:type="spellEnd"/>
+      <w:r>
+        <w:t xml:space="preserve">, </w:t>
+      </w:r>
+      <w:proofErr w:type="spellStart"/>
+      <w:r>
+        <w:t>angle_max</w:t>
+      </w:r>
+      <w:proofErr w:type="spellEnd"/>
+      <w:r>
+        <w:t xml:space="preserve">, and </w:t>
+      </w:r>
+      <w:proofErr w:type="spellStart"/>
+      <w:r>
+        <w:t>angle_increment</w:t>
+      </w:r>
+      <w:proofErr w:type="spellEnd"/>
+      <w:r>
+        <w:t xml:space="preserve"> metadata proved crucial for handling the variability of the physical scanner's ranges vector length</w:t>
+      </w:r>
+      <w:r>
+        <w:t>.</w:t>
+      </w:r>
+    </w:p>
+    <w:p>
+      <w:pPr>
+        <w:ind w:firstLine="0"/>
+      </w:pPr>
+    </w:p>
+    <w:p>
+      <w:pPr>
+        <w:ind w:firstLine="0"/>
+      </w:pPr>
+      <w:r>
+        <w:t>During the simulation phase, we tuned the parameters — the minimum distance from the wall</w:t>
+      </w:r>
+      <w:r>
+        <w:t xml:space="preserve"> </w:t>
+      </w:r>
+      <w:r>
+        <w:t xml:space="preserve">and the linear velocity. As in the simulation, we also carried out several tests to ensure </w:t>
+      </w:r>
+      <w:r>
+        <w:t>consistent</w:t>
+      </w:r>
+      <w:r>
+        <w:t xml:space="preserve"> and homogeneous </w:t>
+      </w:r>
+      <w:r>
+        <w:t>behavior</w:t>
+      </w:r>
+      <w:r>
+        <w:t>.</w:t>
+      </w:r>
+    </w:p>
+    <w:p>
+      <w:pPr>
+        <w:ind w:firstLine="0"/>
+      </w:pPr>
+      <w:r>
+        <w:t>i</w:t>
+      </w:r>
+      <w:r>
+        <w:t>n the end we had decided:</w:t>
+      </w:r>
+    </w:p>
+    <w:p>
+      <w:pPr>
+        <w:ind w:firstLine="0"/>
+      </w:pPr>
+      <w:r>
+        <w:t xml:space="preserve">Linear velocity [m/s] 0.15 </w:t>
+      </w:r>
+    </w:p>
+    <w:p>
+      <w:pPr>
+        <w:ind w:firstLine="0"/>
+      </w:pPr>
+      <w:r>
+        <w:t>Minimum distance [m] 0.4</w:t>
+      </w:r>
+    </w:p>
+    <w:p>
+      <w:pPr>
+        <w:ind w:firstLine="0"/>
+      </w:pPr>
+    </w:p>
+    <w:p>
+      <w:pPr>
+        <w:ind w:firstLine="0"/>
+      </w:pPr>
+      <w:r>
+        <w:t xml:space="preserve">Extracting the free space by dynamically evaluating the regions at 25% and 75% of the array allowed the robot to correctly decide the direction of rotation. From a communication standpoint, the adoption of the </w:t>
+      </w:r>
+      <w:proofErr w:type="spellStart"/>
+      <w:r>
+        <w:t>sensor_data</w:t>
+      </w:r>
+      <w:proofErr w:type="spellEnd"/>
+      <w:r>
+        <w:t xml:space="preserve"> QoS profile (with BEST_EFFORT reliability and VOLATILE durability on a queue limited to 5 messages) prevented latency accumulation in the /scan topic reception, ensuring that evasive maneuvers were processed instantaneously.</w:t>
+      </w:r>
+    </w:p>
+    <w:p>
+      <w:pPr>
+        <w:ind w:firstLine="0"/>
+      </w:pPr>
+    </w:p>
+    <w:p>
+      <w:pPr>
+        <w:pStyle w:val="Titolo2"/>
+      </w:pPr>
+      <w:r>
+        <w:lastRenderedPageBreak/>
         <w:t>Results</w:t>
       </w:r>
       <w:r>
@@ -2550,13 +3100,475 @@
       </w:r>
     </w:p>
     <w:p>
-      <w:r>
-        <w:t>…</w:t>
-      </w:r>
-    </w:p>
-    <w:p>
-      <w:pPr>
-        <w:pStyle w:val="Heading1"/>
+      <w:pPr>
+        <w:ind w:firstLine="0"/>
+      </w:pPr>
+      <w:r>
+        <w:rPr>
+          <w:noProof/>
+        </w:rPr>
+        <w:drawing>
+          <wp:inline distT="0" distB="0" distL="0" distR="0" wp14:anchorId="5646A8EA" wp14:editId="0F6BA2BB">
+            <wp:extent cx="1972733" cy="1219465"/>
+            <wp:effectExtent l="0" t="0" r="8890" b="0"/>
+            <wp:docPr id="484221092" name="Immagine 3" descr="The diagram appears to be a plot or graph, possibly representing some data points or a trend over time or another variable, with numerical values provided for various axes.&#10;&#10;Il contenuto generato dall'IA potrebbe non essere corretto."/>
+            <wp:cNvGraphicFramePr>
+              <a:graphicFrameLocks xmlns:a="http://schemas.openxmlformats.org/drawingml/2006/main" noChangeAspect="1"/>
+            </wp:cNvGraphicFramePr>
+            <a:graphic xmlns:a="http://schemas.openxmlformats.org/drawingml/2006/main">
+              <a:graphicData uri="http://schemas.openxmlformats.org/drawingml/2006/picture">
+                <pic:pic xmlns:pic="http://schemas.openxmlformats.org/drawingml/2006/picture">
+                  <pic:nvPicPr>
+                    <pic:cNvPr id="484221092" name="Immagine 3" descr="The diagram appears to be a plot or graph, possibly representing some data points or a trend over time or another variable, with numerical values provided for various axes.&#10;&#10;Il contenuto generato dall'IA potrebbe non essere corretto."/>
+                    <pic:cNvPicPr>
+                      <a:picLocks noChangeAspect="1" noChangeArrowheads="1"/>
+                    </pic:cNvPicPr>
+                  </pic:nvPicPr>
+                  <pic:blipFill>
+                    <a:blip r:embed="rId12" cstate="print">
+                      <a:extLst>
+                        <a:ext uri="{28A0092B-C50C-407E-A947-70E740481C1C}">
+                          <a14:useLocalDpi xmlns:a14="http://schemas.microsoft.com/office/drawing/2010/main" val="0"/>
+                        </a:ext>
+                      </a:extLst>
+                    </a:blip>
+                    <a:srcRect/>
+                    <a:stretch>
+                      <a:fillRect/>
+                    </a:stretch>
+                  </pic:blipFill>
+                  <pic:spPr bwMode="auto">
+                    <a:xfrm>
+                      <a:off x="0" y="0"/>
+                      <a:ext cx="1977429" cy="1222368"/>
+                    </a:xfrm>
+                    <a:prstGeom prst="rect">
+                      <a:avLst/>
+                    </a:prstGeom>
+                    <a:noFill/>
+                    <a:ln>
+                      <a:noFill/>
+                    </a:ln>
+                  </pic:spPr>
+                </pic:pic>
+              </a:graphicData>
+            </a:graphic>
+          </wp:inline>
+        </w:drawing>
+      </w:r>
+      <w:r>
+        <w:rPr>
+          <w:noProof/>
+        </w:rPr>
+        <w:drawing>
+          <wp:inline distT="0" distB="0" distL="0" distR="0" wp14:anchorId="53BEF17B" wp14:editId="28062950">
+            <wp:extent cx="1980864" cy="1227667"/>
+            <wp:effectExtent l="0" t="0" r="635" b="0"/>
+            <wp:docPr id="16304415" name="Immagine 4" descr="The image depicts a scatter plot with X and Y coordinates, and annotations for ground truth and odometry positions, indicating data points for tracking or positioning.&#10;&#10;Il contenuto generato dall'IA potrebbe non essere corretto."/>
+            <wp:cNvGraphicFramePr>
+              <a:graphicFrameLocks xmlns:a="http://schemas.openxmlformats.org/drawingml/2006/main" noChangeAspect="1"/>
+            </wp:cNvGraphicFramePr>
+            <a:graphic xmlns:a="http://schemas.openxmlformats.org/drawingml/2006/main">
+              <a:graphicData uri="http://schemas.openxmlformats.org/drawingml/2006/picture">
+                <pic:pic xmlns:pic="http://schemas.openxmlformats.org/drawingml/2006/picture">
+                  <pic:nvPicPr>
+                    <pic:cNvPr id="16304415" name="Immagine 4" descr="The image depicts a scatter plot with X and Y coordinates, and annotations for ground truth and odometry positions, indicating data points for tracking or positioning.&#10;&#10;Il contenuto generato dall'IA potrebbe non essere corretto."/>
+                    <pic:cNvPicPr>
+                      <a:picLocks noChangeAspect="1" noChangeArrowheads="1"/>
+                    </pic:cNvPicPr>
+                  </pic:nvPicPr>
+                  <pic:blipFill>
+                    <a:blip r:embed="rId13" cstate="print">
+                      <a:extLst>
+                        <a:ext uri="{28A0092B-C50C-407E-A947-70E740481C1C}">
+                          <a14:useLocalDpi xmlns:a14="http://schemas.microsoft.com/office/drawing/2010/main" val="0"/>
+                        </a:ext>
+                      </a:extLst>
+                    </a:blip>
+                    <a:srcRect/>
+                    <a:stretch>
+                      <a:fillRect/>
+                    </a:stretch>
+                  </pic:blipFill>
+                  <pic:spPr bwMode="auto">
+                    <a:xfrm>
+                      <a:off x="0" y="0"/>
+                      <a:ext cx="1986630" cy="1231241"/>
+                    </a:xfrm>
+                    <a:prstGeom prst="rect">
+                      <a:avLst/>
+                    </a:prstGeom>
+                    <a:noFill/>
+                    <a:ln>
+                      <a:noFill/>
+                    </a:ln>
+                  </pic:spPr>
+                </pic:pic>
+              </a:graphicData>
+            </a:graphic>
+          </wp:inline>
+        </w:drawing>
+      </w:r>
+    </w:p>
+    <w:p>
+      <w:pPr>
+        <w:ind w:firstLine="0"/>
+      </w:pPr>
+    </w:p>
+    <w:p>
+      <w:pPr>
+        <w:ind w:firstLine="0"/>
+      </w:pPr>
+      <w:r>
+        <w:t>The collected results demonstrate the expected functioning of the system. The pose graph extracted from /</w:t>
+      </w:r>
+      <w:proofErr w:type="spellStart"/>
+      <w:r>
+        <w:t>odom</w:t>
+      </w:r>
+      <w:proofErr w:type="spellEnd"/>
+      <w:r>
+        <w:t xml:space="preserve"> faithfully highlights the zig-zag trajectory performed by </w:t>
+      </w:r>
+      <w:proofErr w:type="gramStart"/>
+      <w:r>
+        <w:t>the TurtleBot3</w:t>
+      </w:r>
+      <w:proofErr w:type="gramEnd"/>
+      <w:r>
+        <w:t>. By superimposing this data onto the /</w:t>
+      </w:r>
+      <w:proofErr w:type="spellStart"/>
+      <w:r>
+        <w:t>ground_truth</w:t>
+      </w:r>
+      <w:proofErr w:type="spellEnd"/>
+      <w:r>
+        <w:t xml:space="preserve"> provided by the simulator, a perfect overlap is observed, proving that in the synthetic environment, the differential </w:t>
+      </w:r>
+      <w:proofErr w:type="spellStart"/>
+      <w:r>
+        <w:t>odometric</w:t>
+      </w:r>
+      <w:proofErr w:type="spellEnd"/>
+      <w:r>
+        <w:t xml:space="preserve"> error is negligible</w:t>
+      </w:r>
+      <w:r>
+        <w:t xml:space="preserve"> in the simulation.</w:t>
+      </w:r>
+    </w:p>
+    <w:p>
+      <w:pPr>
+        <w:ind w:firstLine="0"/>
+      </w:pPr>
+    </w:p>
+    <w:p>
+      <w:pPr>
+        <w:ind w:firstLine="0"/>
+      </w:pPr>
+      <w:r>
+        <w:rPr>
+          <w:noProof/>
+        </w:rPr>
+        <w:drawing>
+          <wp:inline distT="0" distB="0" distL="0" distR="0" wp14:anchorId="058ED8C5" wp14:editId="288100A7">
+            <wp:extent cx="2104292" cy="1314286"/>
+            <wp:effectExtent l="0" t="0" r="0" b="635"/>
+            <wp:docPr id="1189268845" name="Immagine 8" descr="&#10;"/>
+            <wp:cNvGraphicFramePr>
+              <a:graphicFrameLocks xmlns:a="http://schemas.openxmlformats.org/drawingml/2006/main" noChangeAspect="1"/>
+            </wp:cNvGraphicFramePr>
+            <a:graphic xmlns:a="http://schemas.openxmlformats.org/drawingml/2006/main">
+              <a:graphicData uri="http://schemas.openxmlformats.org/drawingml/2006/picture">
+                <pic:pic xmlns:pic="http://schemas.openxmlformats.org/drawingml/2006/picture">
+                  <pic:nvPicPr>
+                    <pic:cNvPr id="0" name="Picture 15" descr="&#10;"/>
+                    <pic:cNvPicPr>
+                      <a:picLocks noChangeAspect="1" noChangeArrowheads="1"/>
+                    </pic:cNvPicPr>
+                  </pic:nvPicPr>
+                  <pic:blipFill>
+                    <a:blip r:embed="rId14" cstate="print">
+                      <a:extLst>
+                        <a:ext uri="{28A0092B-C50C-407E-A947-70E740481C1C}">
+                          <a14:useLocalDpi xmlns:a14="http://schemas.microsoft.com/office/drawing/2010/main" val="0"/>
+                        </a:ext>
+                      </a:extLst>
+                    </a:blip>
+                    <a:srcRect/>
+                    <a:stretch>
+                      <a:fillRect/>
+                    </a:stretch>
+                  </pic:blipFill>
+                  <pic:spPr bwMode="auto">
+                    <a:xfrm>
+                      <a:off x="0" y="0"/>
+                      <a:ext cx="2168645" cy="1354479"/>
+                    </a:xfrm>
+                    <a:prstGeom prst="rect">
+                      <a:avLst/>
+                    </a:prstGeom>
+                    <a:noFill/>
+                    <a:ln>
+                      <a:noFill/>
+                    </a:ln>
+                  </pic:spPr>
+                </pic:pic>
+              </a:graphicData>
+            </a:graphic>
+          </wp:inline>
+        </w:drawing>
+      </w:r>
+    </w:p>
+    <w:p>
+      <w:pPr>
+        <w:ind w:firstLine="0"/>
+      </w:pPr>
+      <w:r>
+        <w:rPr>
+          <w:noProof/>
+        </w:rPr>
+        <w:drawing>
+          <wp:inline distT="0" distB="0" distL="0" distR="0" wp14:anchorId="19CD3C64" wp14:editId="02A90066">
+            <wp:extent cx="2103755" cy="1299366"/>
+            <wp:effectExtent l="0" t="0" r="0" b="0"/>
+            <wp:docPr id="1877737087" name="Immagine 9"/>
+            <wp:cNvGraphicFramePr>
+              <a:graphicFrameLocks xmlns:a="http://schemas.openxmlformats.org/drawingml/2006/main" noChangeAspect="1"/>
+            </wp:cNvGraphicFramePr>
+            <a:graphic xmlns:a="http://schemas.openxmlformats.org/drawingml/2006/main">
+              <a:graphicData uri="http://schemas.openxmlformats.org/drawingml/2006/picture">
+                <pic:pic xmlns:pic="http://schemas.openxmlformats.org/drawingml/2006/picture">
+                  <pic:nvPicPr>
+                    <pic:cNvPr id="1877737087" name="Immagine 9"/>
+                    <pic:cNvPicPr>
+                      <a:picLocks noChangeAspect="1" noChangeArrowheads="1"/>
+                    </pic:cNvPicPr>
+                  </pic:nvPicPr>
+                  <pic:blipFill>
+                    <a:blip r:embed="rId15" cstate="print">
+                      <a:extLst>
+                        <a:ext uri="{28A0092B-C50C-407E-A947-70E740481C1C}">
+                          <a14:useLocalDpi xmlns:a14="http://schemas.microsoft.com/office/drawing/2010/main" val="0"/>
+                        </a:ext>
+                      </a:extLst>
+                    </a:blip>
+                    <a:srcRect/>
+                    <a:stretch>
+                      <a:fillRect/>
+                    </a:stretch>
+                  </pic:blipFill>
+                  <pic:spPr bwMode="auto">
+                    <a:xfrm>
+                      <a:off x="0" y="0"/>
+                      <a:ext cx="2153147" cy="1329873"/>
+                    </a:xfrm>
+                    <a:prstGeom prst="rect">
+                      <a:avLst/>
+                    </a:prstGeom>
+                    <a:noFill/>
+                    <a:ln>
+                      <a:noFill/>
+                    </a:ln>
+                  </pic:spPr>
+                </pic:pic>
+              </a:graphicData>
+            </a:graphic>
+          </wp:inline>
+        </w:drawing>
+      </w:r>
+    </w:p>
+    <w:p>
+      <w:pPr>
+        <w:ind w:firstLine="0"/>
+      </w:pPr>
+    </w:p>
+    <w:p>
+      <w:pPr>
+        <w:ind w:firstLine="0"/>
+      </w:pPr>
+      <w:r>
+        <w:t>The analysis of the commands on the /</w:t>
+      </w:r>
+      <w:proofErr w:type="spellStart"/>
+      <w:r>
+        <w:t>cmd_vel</w:t>
+      </w:r>
+      <w:proofErr w:type="spellEnd"/>
+      <w:r>
+        <w:t xml:space="preserve"> multiplexer faithfully reflects the flowchart of the </w:t>
+      </w:r>
+      <w:proofErr w:type="spellStart"/>
+      <w:r>
+        <w:t>Bump&amp;Go</w:t>
+      </w:r>
+      <w:proofErr w:type="spellEnd"/>
+      <w:r>
+        <w:t xml:space="preserve"> controller: the linear velocity on the </w:t>
+      </w:r>
+      <w:r>
+        <w:rPr>
+          <w:i/>
+          <w:iCs/>
+        </w:rPr>
+        <w:t>x</w:t>
+      </w:r>
+      <w:r>
+        <w:t xml:space="preserve">-axis assumes a square wave profile, dropping instantaneously from the maximum value to zero as soon as the </w:t>
+      </w:r>
+      <w:proofErr w:type="spellStart"/>
+      <w:r>
+        <w:t>bumperThreshold</w:t>
+      </w:r>
+      <w:proofErr w:type="spellEnd"/>
+      <w:r>
+        <w:t xml:space="preserve"> is exceeded. At exactly those moments, the angular commands on the </w:t>
+      </w:r>
+      <w:r>
+        <w:rPr>
+          <w:i/>
+          <w:iCs/>
+        </w:rPr>
+        <w:t>z</w:t>
+      </w:r>
+      <w:r>
+        <w:t>-axis calculated by the proportional controller are triggered to actuate the TURNING state to the right or left. Finally, the directional vectors on RViz confirm that the completed rotations are orthogonal, stable, and free from spatial drifts.</w:t>
+      </w:r>
+    </w:p>
+    <w:p>
+      <w:pPr>
+        <w:ind w:firstLine="0"/>
+      </w:pPr>
+    </w:p>
+    <w:p>
+      <w:pPr>
+        <w:ind w:firstLine="0"/>
+      </w:pPr>
+      <w:r>
+        <w:drawing>
+          <wp:inline distT="0" distB="0" distL="0" distR="0" wp14:anchorId="53EF42BC" wp14:editId="70E9902D">
+            <wp:extent cx="1143000" cy="1389976"/>
+            <wp:effectExtent l="0" t="0" r="0" b="1270"/>
+            <wp:docPr id="5899222" name="Immagine 1" descr="The image shows a small, black robotic device being placed on a box with a reflective, metallic surface.&#10;&#10;Il contenuto generato dall'IA potrebbe non essere corretto."/>
+            <wp:cNvGraphicFramePr>
+              <a:graphicFrameLocks xmlns:a="http://schemas.openxmlformats.org/drawingml/2006/main" noChangeAspect="1"/>
+            </wp:cNvGraphicFramePr>
+            <a:graphic xmlns:a="http://schemas.openxmlformats.org/drawingml/2006/main">
+              <a:graphicData uri="http://schemas.openxmlformats.org/drawingml/2006/picture">
+                <pic:pic xmlns:pic="http://schemas.openxmlformats.org/drawingml/2006/picture">
+                  <pic:nvPicPr>
+                    <pic:cNvPr id="5899222" name="Immagine 1" descr="The image shows a small, black robotic device being placed on a box with a reflective, metallic surface.&#10;&#10;Il contenuto generato dall'IA potrebbe non essere corretto."/>
+                    <pic:cNvPicPr/>
+                  </pic:nvPicPr>
+                  <pic:blipFill>
+                    <a:blip r:embed="rId16"/>
+                    <a:stretch>
+                      <a:fillRect/>
+                    </a:stretch>
+                  </pic:blipFill>
+                  <pic:spPr>
+                    <a:xfrm>
+                      <a:off x="0" y="0"/>
+                      <a:ext cx="1163012" cy="1414312"/>
+                    </a:xfrm>
+                    <a:prstGeom prst="rect">
+                      <a:avLst/>
+                    </a:prstGeom>
+                  </pic:spPr>
+                </pic:pic>
+              </a:graphicData>
+            </a:graphic>
+          </wp:inline>
+        </w:drawing>
+      </w:r>
+      <w:r>
+        <w:rPr>
+          <w:rFonts w:ascii="Arial" w:hAnsi="Arial" w:cs="Arial"/>
+          <w:b/>
+          <w:bCs/>
+          <w:noProof/>
+          <w:color w:val="000000"/>
+          <w:sz w:val="32"/>
+          <w:szCs w:val="32"/>
+        </w:rPr>
+        <w:drawing>
+          <wp:inline distT="0" distB="0" distL="0" distR="0" wp14:anchorId="76236460" wp14:editId="4B4D03AF">
+            <wp:extent cx="2023533" cy="1244784"/>
+            <wp:effectExtent l="0" t="0" r="0" b="0"/>
+            <wp:docPr id="207471238" name="Immagine 7" descr="The diagram shows a series of coordinates plotted on a two-dimensional grid, indicating positions along the x-axis and y-axis at various intervals.&#10;&#10;Il contenuto generato dall'IA potrebbe non essere corretto."/>
+            <wp:cNvGraphicFramePr>
+              <a:graphicFrameLocks xmlns:a="http://schemas.openxmlformats.org/drawingml/2006/main" noChangeAspect="1"/>
+            </wp:cNvGraphicFramePr>
+            <a:graphic xmlns:a="http://schemas.openxmlformats.org/drawingml/2006/main">
+              <a:graphicData uri="http://schemas.openxmlformats.org/drawingml/2006/picture">
+                <pic:pic xmlns:pic="http://schemas.openxmlformats.org/drawingml/2006/picture">
+                  <pic:nvPicPr>
+                    <pic:cNvPr id="207471238" name="Immagine 7" descr="The diagram shows a series of coordinates plotted on a two-dimensional grid, indicating positions along the x-axis and y-axis at various intervals.&#10;&#10;Il contenuto generato dall'IA potrebbe non essere corretto."/>
+                    <pic:cNvPicPr>
+                      <a:picLocks noChangeAspect="1" noChangeArrowheads="1"/>
+                    </pic:cNvPicPr>
+                  </pic:nvPicPr>
+                  <pic:blipFill>
+                    <a:blip r:embed="rId17" cstate="print">
+                      <a:extLst>
+                        <a:ext uri="{28A0092B-C50C-407E-A947-70E740481C1C}">
+                          <a14:useLocalDpi xmlns:a14="http://schemas.microsoft.com/office/drawing/2010/main" val="0"/>
+                        </a:ext>
+                      </a:extLst>
+                    </a:blip>
+                    <a:srcRect/>
+                    <a:stretch>
+                      <a:fillRect/>
+                    </a:stretch>
+                  </pic:blipFill>
+                  <pic:spPr bwMode="auto">
+                    <a:xfrm>
+                      <a:off x="0" y="0"/>
+                      <a:ext cx="2071051" cy="1274015"/>
+                    </a:xfrm>
+                    <a:prstGeom prst="rect">
+                      <a:avLst/>
+                    </a:prstGeom>
+                    <a:noFill/>
+                    <a:ln>
+                      <a:noFill/>
+                    </a:ln>
+                  </pic:spPr>
+                </pic:pic>
+              </a:graphicData>
+            </a:graphic>
+          </wp:inline>
+        </w:drawing>
+      </w:r>
+    </w:p>
+    <w:p>
+      <w:pPr>
+        <w:ind w:firstLine="0"/>
+      </w:pPr>
+      <w:r>
+        <w:t xml:space="preserve">This plot shows the robot trajectory during the real test. We can see that the robot follows the track well, is able </w:t>
+      </w:r>
+    </w:p>
+    <w:p>
+      <w:pPr>
+        <w:ind w:firstLine="0"/>
+      </w:pPr>
+      <w:r>
+        <w:t xml:space="preserve">to avoid obstacles and </w:t>
+      </w:r>
+      <w:proofErr w:type="gramStart"/>
+      <w:r>
+        <w:t>behaves</w:t>
+      </w:r>
+      <w:proofErr w:type="gramEnd"/>
+      <w:r>
+        <w:t xml:space="preserve"> almost the same as in the virtual simulation.</w:t>
+      </w:r>
+    </w:p>
+    <w:p>
+      <w:pPr>
+        <w:pStyle w:val="Titolo1"/>
       </w:pPr>
       <w:r>
         <w:t>Conclusions</w:t>
@@ -2564,117 +3576,134 @@
     </w:p>
     <w:p>
       <w:r>
-        <w:t xml:space="preserve">Provide here </w:t>
-      </w:r>
-      <w:r>
-        <w:t>comments</w:t>
-      </w:r>
-      <w:r>
-        <w:t xml:space="preserve"> and considerations on the </w:t>
-      </w:r>
-      <w:r>
-        <w:t>overall laboratory activity</w:t>
-      </w:r>
-      <w:r>
-        <w:t xml:space="preserve">. </w:t>
-      </w:r>
-      <w:r>
-        <w:t>These are some of the questions that you can answer to:</w:t>
-      </w:r>
-    </w:p>
-    <w:p>
-      <w:pPr>
-        <w:pStyle w:val="ListParagraph"/>
-      </w:pPr>
-      <w:r>
-        <w:t xml:space="preserve">Did you </w:t>
-      </w:r>
-      <w:r>
-        <w:t>reach</w:t>
-      </w:r>
-      <w:r>
-        <w:t xml:space="preserve"> all the objectives required by the lab activity? </w:t>
-      </w:r>
-      <w:r>
-        <w:t xml:space="preserve"> </w:t>
-      </w:r>
-    </w:p>
-    <w:p>
-      <w:pPr>
-        <w:pStyle w:val="ListParagraph"/>
-      </w:pPr>
-      <w:r>
-        <w:t xml:space="preserve">If some of the objectives </w:t>
-      </w:r>
-      <w:r>
-        <w:t>are</w:t>
-      </w:r>
-      <w:r>
-        <w:t xml:space="preserve"> </w:t>
-      </w:r>
-      <w:r>
-        <w:t xml:space="preserve">not fulfilled or only partially fulfilled, why? </w:t>
-      </w:r>
-    </w:p>
-    <w:p>
-      <w:pPr>
-        <w:pStyle w:val="ListParagraph"/>
-      </w:pPr>
-      <w:r>
-        <w:t xml:space="preserve">Which </w:t>
-      </w:r>
-      <w:r>
-        <w:t>are</w:t>
-      </w:r>
-      <w:r>
-        <w:t xml:space="preserve"> the critical point</w:t>
-      </w:r>
-      <w:r>
-        <w:t>s</w:t>
-      </w:r>
-      <w:r>
-        <w:t xml:space="preserve"> that you </w:t>
-      </w:r>
-      <w:r>
-        <w:t>faced during the development of this activity?</w:t>
-      </w:r>
-    </w:p>
-    <w:p>
-      <w:pPr>
-        <w:pStyle w:val="ListParagraph"/>
-      </w:pPr>
-      <w:r>
-        <w:t>How did the system behave under non-ideal or unexpected conditions?</w:t>
-      </w:r>
-    </w:p>
-    <w:p>
-      <w:pPr>
-        <w:pStyle w:val="ListParagraph"/>
-      </w:pPr>
-      <w:r>
-        <w:t>What gaps exist between the simulated environment and real hardware execution?</w:t>
-      </w:r>
-    </w:p>
-    <w:p>
-      <w:pPr>
-        <w:pStyle w:val="ListParagraph"/>
-      </w:pPr>
-      <w:r>
-        <w:t>What specific features or optimizations would you add if given more time?</w:t>
-      </w:r>
-    </w:p>
-    <w:p>
-      <w:pPr>
-        <w:pStyle w:val="ListParagraph"/>
-      </w:pPr>
-      <w:r>
-        <w:t>And many more…</w:t>
-      </w:r>
-      <w:r>
-        <w:t>…</w:t>
-      </w:r>
-    </w:p>
-    <w:p/>
+        <w:t xml:space="preserve">All architectural and functional objectives set forth by the laboratory activity were successfully achieved. The implemented Python ROS 2 node autonomously governed the TurtleBot3’s kinematics through a purely reactive </w:t>
+      </w:r>
+      <w:proofErr w:type="spellStart"/>
+      <w:r>
+        <w:t>Bump&amp;Go</w:t>
+      </w:r>
+      <w:proofErr w:type="spellEnd"/>
+      <w:r>
+        <w:t xml:space="preserve"> navigation paradigm, successfully guiding the robot along the wall-delimited path to the </w:t>
+      </w:r>
+      <w:proofErr w:type="gramStart"/>
+      <w:r>
+        <w:t>final destination</w:t>
+      </w:r>
+      <w:proofErr w:type="gramEnd"/>
+      <w:r>
+        <w:t xml:space="preserve"> in both the Gazebo simulation and the physical hardware deployment.</w:t>
+      </w:r>
+    </w:p>
+    <w:p>
+      <w:pPr>
+        <w:ind w:firstLine="0"/>
+      </w:pPr>
+    </w:p>
+    <w:p>
+      <w:pPr>
+        <w:ind w:firstLine="0"/>
+      </w:pPr>
+      <w:r>
+        <w:t xml:space="preserve">The most critical engineering challenges faced during development revolved around the abstraction and pre-processing of the raw LiDAR sensory payload. On the physical robot, the LDS-01/LDS-02 scanner produces a variable-length ranges array, which necessitated abandoning the static indexing used in simulation in favor of a dynamic sector-partitioning algorithm based on the </w:t>
+      </w:r>
+      <w:proofErr w:type="spellStart"/>
+      <w:r>
+        <w:t>angle_min</w:t>
+      </w:r>
+      <w:proofErr w:type="spellEnd"/>
+      <w:r>
+        <w:t xml:space="preserve">, </w:t>
+      </w:r>
+      <w:proofErr w:type="spellStart"/>
+      <w:r>
+        <w:t>angle_max</w:t>
+      </w:r>
+      <w:proofErr w:type="spellEnd"/>
+      <w:r>
+        <w:t xml:space="preserve">, and </w:t>
+      </w:r>
+      <w:proofErr w:type="spellStart"/>
+      <w:r>
+        <w:t>angle_increment</w:t>
+      </w:r>
+      <w:proofErr w:type="spellEnd"/>
+      <w:r>
+        <w:t xml:space="preserve"> metadata.</w:t>
+      </w:r>
+    </w:p>
+    <w:p>
+      <w:pPr>
+        <w:ind w:firstLine="0"/>
+      </w:pPr>
+      <w:r>
+        <w:t>Under non-ideal conditions, such as the presence of stochastic measurement noise and infinite (</w:t>
+      </w:r>
+      <w:proofErr w:type="spellStart"/>
+      <w:r>
+        <w:t>range_max</w:t>
+      </w:r>
+      <w:proofErr w:type="spellEnd"/>
+      <w:r>
+        <w:t xml:space="preserve">) out-of-bounds readings, the system remained robust. This stability was achieved by clipping the raw data to the sensor's reliable limits and applying a median filter to the 10-degree field of view, effectively rejecting Gaussian noise and preventing false obstacle detections. Additionally, to handle non-ideal network latency over Wi-Fi, the /scan subscriber was strictly configured with a </w:t>
+      </w:r>
+      <w:proofErr w:type="spellStart"/>
+      <w:r>
+        <w:t>sensor_data</w:t>
+      </w:r>
+      <w:proofErr w:type="spellEnd"/>
+      <w:r>
+        <w:t xml:space="preserve"> Quality of Service (QoS) profile</w:t>
+      </w:r>
+      <w:r>
+        <w:t>.</w:t>
+      </w:r>
+    </w:p>
+    <w:p>
+      <w:pPr>
+        <w:ind w:firstLine="0"/>
+      </w:pPr>
+    </w:p>
+    <w:p>
+      <w:pPr>
+        <w:ind w:firstLine="0"/>
+      </w:pPr>
+      <w:r>
+        <w:t xml:space="preserve">The transition from the simulated environment to the real hardware prominently highlighted the intrinsic "reality gap" of mobile robotics. In the Gazebo simulation, the </w:t>
+      </w:r>
+      <w:proofErr w:type="spellStart"/>
+      <w:r>
+        <w:t>odometric</w:t>
+      </w:r>
+      <w:proofErr w:type="spellEnd"/>
+      <w:r>
+        <w:t xml:space="preserve"> estimation (/</w:t>
+      </w:r>
+      <w:proofErr w:type="spellStart"/>
+      <w:r>
+        <w:t>odom</w:t>
+      </w:r>
+      <w:proofErr w:type="spellEnd"/>
+      <w:r>
+        <w:t>) perfectly matched the absolute /</w:t>
+      </w:r>
+      <w:proofErr w:type="spellStart"/>
+      <w:r>
+        <w:t>ground_truth</w:t>
+      </w:r>
+      <w:proofErr w:type="spellEnd"/>
+      <w:r>
+        <w:t xml:space="preserve">, demonstrating zero cumulative error. Conversely, physical hardware execution introduced significant dead-reckoning drift. The real TurtleBot3's trajectory was affected by wheel slip-ratio, asymmetrical floor friction, and encoder inaccuracies, which progressively degraded the purely </w:t>
+      </w:r>
+      <w:proofErr w:type="spellStart"/>
+      <w:r>
+        <w:t>odometric</w:t>
+      </w:r>
+      <w:proofErr w:type="spellEnd"/>
+      <w:r>
+        <w:t xml:space="preserve"> localization over time</w:t>
+      </w:r>
+    </w:p>
     <w:sectPr>
       <w:type w:val="continuous"/>
       <w:pgSz w:w="11906" w:h="16838"/>
@@ -2807,7 +3836,7 @@
     <w:lvl w:ilvl="0" w:tplc="9BFA31B2">
       <w:start w:val="1"/>
       <w:numFmt w:val="upperRoman"/>
-      <w:pStyle w:val="Heading1"/>
+      <w:pStyle w:val="Titolo1"/>
       <w:suff w:val="space"/>
       <w:lvlText w:val="%1."/>
       <w:lvlJc w:val="right"/>
@@ -2821,7 +3850,7 @@
     <w:lvl w:ilvl="1" w:tplc="EA8C93E6">
       <w:start w:val="1"/>
       <w:numFmt w:val="upperLetter"/>
-      <w:pStyle w:val="Heading2"/>
+      <w:pStyle w:val="Titolo2"/>
       <w:suff w:val="space"/>
       <w:lvlText w:val="%2."/>
       <w:lvlJc w:val="left"/>
@@ -3105,7 +4134,7 @@
     <w:lvl w:ilvl="0" w:tplc="C5586870">
       <w:start w:val="1"/>
       <w:numFmt w:val="bullet"/>
-      <w:pStyle w:val="ListParagraph"/>
+      <w:pStyle w:val="Paragrafoelenco"/>
       <w:lvlText w:val=""/>
       <w:lvlJc w:val="left"/>
       <w:pPr>
@@ -3946,7 +4975,7 @@
     <w:lsdException w:name="Unresolved Mention" w:semiHidden="1" w:unhideWhenUsed="1"/>
     <w:lsdException w:name="Smart Link" w:semiHidden="1" w:unhideWhenUsed="1"/>
   </w:latentStyles>
-  <w:style w:type="paragraph" w:default="1" w:styleId="Normal">
+  <w:style w:type="paragraph" w:default="1" w:styleId="Normale">
     <w:name w:val="Normal"/>
     <w:qFormat/>
     <w:rsid w:val="00F94605"/>
@@ -3961,12 +4990,12 @@
       <w:lang w:val="en-US"/>
     </w:rPr>
   </w:style>
-  <w:style w:type="paragraph" w:styleId="Heading1">
+  <w:style w:type="paragraph" w:styleId="Titolo1">
     <w:name w:val="heading 1"/>
     <w:aliases w:val="Section"/>
-    <w:basedOn w:val="Normal"/>
-    <w:next w:val="Normal"/>
-    <w:link w:val="Heading1Char"/>
+    <w:basedOn w:val="Normale"/>
+    <w:next w:val="Normale"/>
+    <w:link w:val="Titolo1Carattere"/>
     <w:uiPriority w:val="9"/>
     <w:qFormat/>
     <w:rsid w:val="00864965"/>
@@ -3988,12 +5017,12 @@
       <w:szCs w:val="20"/>
     </w:rPr>
   </w:style>
-  <w:style w:type="paragraph" w:styleId="Heading2">
+  <w:style w:type="paragraph" w:styleId="Titolo2">
     <w:name w:val="heading 2"/>
     <w:aliases w:val="Subsection"/>
-    <w:basedOn w:val="Heading1"/>
-    <w:next w:val="Normal"/>
-    <w:link w:val="Heading2Char"/>
+    <w:basedOn w:val="Titolo1"/>
+    <w:next w:val="Normale"/>
+    <w:link w:val="Titolo2Carattere"/>
     <w:uiPriority w:val="9"/>
     <w:unhideWhenUsed/>
     <w:qFormat/>
@@ -4013,11 +5042,11 @@
       <w:smallCaps w:val="0"/>
     </w:rPr>
   </w:style>
-  <w:style w:type="paragraph" w:styleId="Heading3">
+  <w:style w:type="paragraph" w:styleId="Titolo3">
     <w:name w:val="heading 3"/>
-    <w:basedOn w:val="Normal"/>
-    <w:next w:val="Normal"/>
-    <w:link w:val="Heading3Char"/>
+    <w:basedOn w:val="Normale"/>
+    <w:next w:val="Normale"/>
+    <w:link w:val="Titolo3Carattere"/>
     <w:uiPriority w:val="9"/>
     <w:semiHidden/>
     <w:unhideWhenUsed/>
@@ -4036,11 +5065,11 @@
       <w:szCs w:val="28"/>
     </w:rPr>
   </w:style>
-  <w:style w:type="paragraph" w:styleId="Heading4">
+  <w:style w:type="paragraph" w:styleId="Titolo4">
     <w:name w:val="heading 4"/>
-    <w:basedOn w:val="Normal"/>
-    <w:next w:val="Normal"/>
-    <w:link w:val="Heading4Char"/>
+    <w:basedOn w:val="Normale"/>
+    <w:next w:val="Normale"/>
+    <w:link w:val="Titolo4Carattere"/>
     <w:uiPriority w:val="9"/>
     <w:semiHidden/>
     <w:unhideWhenUsed/>
@@ -4059,11 +5088,11 @@
       <w:color w:val="0F4761" w:themeColor="accent1" w:themeShade="BF"/>
     </w:rPr>
   </w:style>
-  <w:style w:type="paragraph" w:styleId="Heading5">
+  <w:style w:type="paragraph" w:styleId="Titolo5">
     <w:name w:val="heading 5"/>
-    <w:basedOn w:val="Normal"/>
-    <w:next w:val="Normal"/>
-    <w:link w:val="Heading5Char"/>
+    <w:basedOn w:val="Normale"/>
+    <w:next w:val="Normale"/>
+    <w:link w:val="Titolo5Carattere"/>
     <w:uiPriority w:val="9"/>
     <w:semiHidden/>
     <w:unhideWhenUsed/>
@@ -4080,11 +5109,11 @@
       <w:color w:val="0F4761" w:themeColor="accent1" w:themeShade="BF"/>
     </w:rPr>
   </w:style>
-  <w:style w:type="paragraph" w:styleId="Heading6">
+  <w:style w:type="paragraph" w:styleId="Titolo6">
     <w:name w:val="heading 6"/>
-    <w:basedOn w:val="Normal"/>
-    <w:next w:val="Normal"/>
-    <w:link w:val="Heading6Char"/>
+    <w:basedOn w:val="Normale"/>
+    <w:next w:val="Normale"/>
+    <w:link w:val="Titolo6Carattere"/>
     <w:uiPriority w:val="9"/>
     <w:semiHidden/>
     <w:unhideWhenUsed/>
@@ -4103,11 +5132,11 @@
       <w:color w:val="595959" w:themeColor="text1" w:themeTint="A6"/>
     </w:rPr>
   </w:style>
-  <w:style w:type="paragraph" w:styleId="Heading7">
+  <w:style w:type="paragraph" w:styleId="Titolo7">
     <w:name w:val="heading 7"/>
-    <w:basedOn w:val="Normal"/>
-    <w:next w:val="Normal"/>
-    <w:link w:val="Heading7Char"/>
+    <w:basedOn w:val="Normale"/>
+    <w:next w:val="Normale"/>
+    <w:link w:val="Titolo7Carattere"/>
     <w:uiPriority w:val="9"/>
     <w:semiHidden/>
     <w:unhideWhenUsed/>
@@ -4124,11 +5153,11 @@
       <w:color w:val="595959" w:themeColor="text1" w:themeTint="A6"/>
     </w:rPr>
   </w:style>
-  <w:style w:type="paragraph" w:styleId="Heading8">
+  <w:style w:type="paragraph" w:styleId="Titolo8">
     <w:name w:val="heading 8"/>
-    <w:basedOn w:val="Normal"/>
-    <w:next w:val="Normal"/>
-    <w:link w:val="Heading8Char"/>
+    <w:basedOn w:val="Normale"/>
+    <w:next w:val="Normale"/>
+    <w:link w:val="Titolo8Carattere"/>
     <w:uiPriority w:val="9"/>
     <w:semiHidden/>
     <w:unhideWhenUsed/>
@@ -4146,11 +5175,11 @@
       <w:color w:val="272727" w:themeColor="text1" w:themeTint="D8"/>
     </w:rPr>
   </w:style>
-  <w:style w:type="paragraph" w:styleId="Heading9">
+  <w:style w:type="paragraph" w:styleId="Titolo9">
     <w:name w:val="heading 9"/>
-    <w:basedOn w:val="Normal"/>
-    <w:next w:val="Normal"/>
-    <w:link w:val="Heading9Char"/>
+    <w:basedOn w:val="Normale"/>
+    <w:next w:val="Normale"/>
+    <w:link w:val="Titolo9Carattere"/>
     <w:uiPriority w:val="9"/>
     <w:semiHidden/>
     <w:unhideWhenUsed/>
@@ -4166,12 +5195,12 @@
       <w:color w:val="272727" w:themeColor="text1" w:themeTint="D8"/>
     </w:rPr>
   </w:style>
-  <w:style w:type="character" w:default="1" w:styleId="DefaultParagraphFont">
+  <w:style w:type="character" w:default="1" w:styleId="Carpredefinitoparagrafo">
     <w:name w:val="Default Paragraph Font"/>
     <w:uiPriority w:val="1"/>
     <w:unhideWhenUsed/>
   </w:style>
-  <w:style w:type="table" w:default="1" w:styleId="TableNormal">
+  <w:style w:type="table" w:default="1" w:styleId="Tabellanormale">
     <w:name w:val="Normal Table"/>
     <w:uiPriority w:val="99"/>
     <w:semiHidden/>
@@ -4186,17 +5215,17 @@
       </w:tblCellMar>
     </w:tblPr>
   </w:style>
-  <w:style w:type="numbering" w:default="1" w:styleId="NoList">
+  <w:style w:type="numbering" w:default="1" w:styleId="Nessunelenco">
     <w:name w:val="No List"/>
     <w:uiPriority w:val="99"/>
     <w:semiHidden/>
     <w:unhideWhenUsed/>
   </w:style>
-  <w:style w:type="character" w:customStyle="1" w:styleId="Heading1Char">
-    <w:name w:val="Heading 1 Char"/>
-    <w:aliases w:val="Section Char"/>
-    <w:basedOn w:val="DefaultParagraphFont"/>
-    <w:link w:val="Heading1"/>
+  <w:style w:type="character" w:customStyle="1" w:styleId="Titolo1Carattere">
+    <w:name w:val="Titolo 1 Carattere"/>
+    <w:aliases w:val="Section Carattere"/>
+    <w:basedOn w:val="Carpredefinitoparagrafo"/>
+    <w:link w:val="Titolo1"/>
     <w:uiPriority w:val="9"/>
     <w:rsid w:val="00864965"/>
     <w:rPr>
@@ -4208,11 +5237,11 @@
       <w:lang w:val="en-US"/>
     </w:rPr>
   </w:style>
-  <w:style w:type="character" w:customStyle="1" w:styleId="Heading2Char">
-    <w:name w:val="Heading 2 Char"/>
-    <w:aliases w:val="Subsection Char"/>
-    <w:basedOn w:val="DefaultParagraphFont"/>
-    <w:link w:val="Heading2"/>
+  <w:style w:type="character" w:customStyle="1" w:styleId="Titolo2Carattere">
+    <w:name w:val="Titolo 2 Carattere"/>
+    <w:aliases w:val="Subsection Carattere"/>
+    <w:basedOn w:val="Carpredefinitoparagrafo"/>
+    <w:link w:val="Titolo2"/>
     <w:uiPriority w:val="9"/>
     <w:rsid w:val="00153E4B"/>
     <w:rPr>
@@ -4224,10 +5253,10 @@
       <w:lang w:val="en-US"/>
     </w:rPr>
   </w:style>
-  <w:style w:type="character" w:customStyle="1" w:styleId="Heading3Char">
-    <w:name w:val="Heading 3 Char"/>
-    <w:basedOn w:val="DefaultParagraphFont"/>
-    <w:link w:val="Heading3"/>
+  <w:style w:type="character" w:customStyle="1" w:styleId="Titolo3Carattere">
+    <w:name w:val="Titolo 3 Carattere"/>
+    <w:basedOn w:val="Carpredefinitoparagrafo"/>
+    <w:link w:val="Titolo3"/>
     <w:uiPriority w:val="9"/>
     <w:semiHidden/>
     <w:rsid w:val="002A24B4"/>
@@ -4238,10 +5267,10 @@
       <w:szCs w:val="28"/>
     </w:rPr>
   </w:style>
-  <w:style w:type="character" w:customStyle="1" w:styleId="Heading4Char">
-    <w:name w:val="Heading 4 Char"/>
-    <w:basedOn w:val="DefaultParagraphFont"/>
-    <w:link w:val="Heading4"/>
+  <w:style w:type="character" w:customStyle="1" w:styleId="Titolo4Carattere">
+    <w:name w:val="Titolo 4 Carattere"/>
+    <w:basedOn w:val="Carpredefinitoparagrafo"/>
+    <w:link w:val="Titolo4"/>
     <w:uiPriority w:val="9"/>
     <w:semiHidden/>
     <w:rsid w:val="002A24B4"/>
@@ -4252,10 +5281,10 @@
       <w:color w:val="0F4761" w:themeColor="accent1" w:themeShade="BF"/>
     </w:rPr>
   </w:style>
-  <w:style w:type="character" w:customStyle="1" w:styleId="Heading5Char">
-    <w:name w:val="Heading 5 Char"/>
-    <w:basedOn w:val="DefaultParagraphFont"/>
-    <w:link w:val="Heading5"/>
+  <w:style w:type="character" w:customStyle="1" w:styleId="Titolo5Carattere">
+    <w:name w:val="Titolo 5 Carattere"/>
+    <w:basedOn w:val="Carpredefinitoparagrafo"/>
+    <w:link w:val="Titolo5"/>
     <w:uiPriority w:val="9"/>
     <w:semiHidden/>
     <w:rsid w:val="002A24B4"/>
@@ -4264,10 +5293,10 @@
       <w:color w:val="0F4761" w:themeColor="accent1" w:themeShade="BF"/>
     </w:rPr>
   </w:style>
-  <w:style w:type="character" w:customStyle="1" w:styleId="Heading6Char">
-    <w:name w:val="Heading 6 Char"/>
-    <w:basedOn w:val="DefaultParagraphFont"/>
-    <w:link w:val="Heading6"/>
+  <w:style w:type="character" w:customStyle="1" w:styleId="Titolo6Carattere">
+    <w:name w:val="Titolo 6 Carattere"/>
+    <w:basedOn w:val="Carpredefinitoparagrafo"/>
+    <w:link w:val="Titolo6"/>
     <w:uiPriority w:val="9"/>
     <w:semiHidden/>
     <w:rsid w:val="002A24B4"/>
@@ -4278,10 +5307,10 @@
       <w:color w:val="595959" w:themeColor="text1" w:themeTint="A6"/>
     </w:rPr>
   </w:style>
-  <w:style w:type="character" w:customStyle="1" w:styleId="Heading7Char">
-    <w:name w:val="Heading 7 Char"/>
-    <w:basedOn w:val="DefaultParagraphFont"/>
-    <w:link w:val="Heading7"/>
+  <w:style w:type="character" w:customStyle="1" w:styleId="Titolo7Carattere">
+    <w:name w:val="Titolo 7 Carattere"/>
+    <w:basedOn w:val="Carpredefinitoparagrafo"/>
+    <w:link w:val="Titolo7"/>
     <w:uiPriority w:val="9"/>
     <w:semiHidden/>
     <w:rsid w:val="002A24B4"/>
@@ -4290,10 +5319,10 @@
       <w:color w:val="595959" w:themeColor="text1" w:themeTint="A6"/>
     </w:rPr>
   </w:style>
-  <w:style w:type="character" w:customStyle="1" w:styleId="Heading8Char">
-    <w:name w:val="Heading 8 Char"/>
-    <w:basedOn w:val="DefaultParagraphFont"/>
-    <w:link w:val="Heading8"/>
+  <w:style w:type="character" w:customStyle="1" w:styleId="Titolo8Carattere">
+    <w:name w:val="Titolo 8 Carattere"/>
+    <w:basedOn w:val="Carpredefinitoparagrafo"/>
+    <w:link w:val="Titolo8"/>
     <w:uiPriority w:val="9"/>
     <w:semiHidden/>
     <w:rsid w:val="002A24B4"/>
@@ -4304,10 +5333,10 @@
       <w:color w:val="272727" w:themeColor="text1" w:themeTint="D8"/>
     </w:rPr>
   </w:style>
-  <w:style w:type="character" w:customStyle="1" w:styleId="Heading9Char">
-    <w:name w:val="Heading 9 Char"/>
-    <w:basedOn w:val="DefaultParagraphFont"/>
-    <w:link w:val="Heading9"/>
+  <w:style w:type="character" w:customStyle="1" w:styleId="Titolo9Carattere">
+    <w:name w:val="Titolo 9 Carattere"/>
+    <w:basedOn w:val="Carpredefinitoparagrafo"/>
+    <w:link w:val="Titolo9"/>
     <w:uiPriority w:val="9"/>
     <w:semiHidden/>
     <w:rsid w:val="002A24B4"/>
@@ -4316,11 +5345,11 @@
       <w:color w:val="272727" w:themeColor="text1" w:themeTint="D8"/>
     </w:rPr>
   </w:style>
-  <w:style w:type="paragraph" w:styleId="Title">
+  <w:style w:type="paragraph" w:styleId="Titolo">
     <w:name w:val="Title"/>
-    <w:basedOn w:val="Normal"/>
-    <w:next w:val="Normal"/>
-    <w:link w:val="TitleChar"/>
+    <w:basedOn w:val="Normale"/>
+    <w:next w:val="Normale"/>
+    <w:link w:val="TitoloCarattere"/>
     <w:uiPriority w:val="10"/>
     <w:qFormat/>
     <w:rsid w:val="00F2380A"/>
@@ -4337,10 +5366,10 @@
       <w:szCs w:val="56"/>
     </w:rPr>
   </w:style>
-  <w:style w:type="character" w:customStyle="1" w:styleId="TitleChar">
-    <w:name w:val="Title Char"/>
-    <w:basedOn w:val="DefaultParagraphFont"/>
-    <w:link w:val="Title"/>
+  <w:style w:type="character" w:customStyle="1" w:styleId="TitoloCarattere">
+    <w:name w:val="Titolo Carattere"/>
+    <w:basedOn w:val="Carpredefinitoparagrafo"/>
+    <w:link w:val="Titolo"/>
     <w:uiPriority w:val="10"/>
     <w:rsid w:val="00F2380A"/>
     <w:rPr>
@@ -4352,11 +5381,11 @@
       <w:lang w:val="en-US"/>
     </w:rPr>
   </w:style>
-  <w:style w:type="paragraph" w:styleId="Subtitle">
+  <w:style w:type="paragraph" w:styleId="Sottotitolo">
     <w:name w:val="Subtitle"/>
-    <w:basedOn w:val="Normal"/>
-    <w:next w:val="Normal"/>
-    <w:link w:val="SubtitleChar"/>
+    <w:basedOn w:val="Normale"/>
+    <w:next w:val="Normale"/>
+    <w:link w:val="SottotitoloCarattere"/>
     <w:uiPriority w:val="11"/>
     <w:qFormat/>
     <w:rsid w:val="00153E4B"/>
@@ -4376,10 +5405,10 @@
       <w:szCs w:val="28"/>
     </w:rPr>
   </w:style>
-  <w:style w:type="character" w:customStyle="1" w:styleId="SubtitleChar">
-    <w:name w:val="Subtitle Char"/>
-    <w:basedOn w:val="DefaultParagraphFont"/>
-    <w:link w:val="Subtitle"/>
+  <w:style w:type="character" w:customStyle="1" w:styleId="SottotitoloCarattere">
+    <w:name w:val="Sottotitolo Carattere"/>
+    <w:basedOn w:val="Carpredefinitoparagrafo"/>
+    <w:link w:val="Sottotitolo"/>
     <w:uiPriority w:val="11"/>
     <w:rsid w:val="00153E4B"/>
     <w:rPr>
@@ -4391,11 +5420,11 @@
       <w:lang w:val="en-US"/>
     </w:rPr>
   </w:style>
-  <w:style w:type="paragraph" w:styleId="Quote">
+  <w:style w:type="paragraph" w:styleId="Citazione">
     <w:name w:val="Quote"/>
-    <w:basedOn w:val="Normal"/>
-    <w:next w:val="Normal"/>
-    <w:link w:val="QuoteChar"/>
+    <w:basedOn w:val="Normale"/>
+    <w:next w:val="Normale"/>
+    <w:link w:val="CitazioneCarattere"/>
     <w:uiPriority w:val="29"/>
     <w:qFormat/>
     <w:rsid w:val="002A24B4"/>
@@ -4409,10 +5438,10 @@
       <w:color w:val="404040" w:themeColor="text1" w:themeTint="BF"/>
     </w:rPr>
   </w:style>
-  <w:style w:type="character" w:customStyle="1" w:styleId="QuoteChar">
-    <w:name w:val="Quote Char"/>
-    <w:basedOn w:val="DefaultParagraphFont"/>
-    <w:link w:val="Quote"/>
+  <w:style w:type="character" w:customStyle="1" w:styleId="CitazioneCarattere">
+    <w:name w:val="Citazione Carattere"/>
+    <w:basedOn w:val="Carpredefinitoparagrafo"/>
+    <w:link w:val="Citazione"/>
     <w:uiPriority w:val="29"/>
     <w:rsid w:val="002A24B4"/>
     <w:rPr>
@@ -4421,9 +5450,9 @@
       <w:color w:val="404040" w:themeColor="text1" w:themeTint="BF"/>
     </w:rPr>
   </w:style>
-  <w:style w:type="paragraph" w:styleId="ListParagraph">
+  <w:style w:type="paragraph" w:styleId="Paragrafoelenco">
     <w:name w:val="List Paragraph"/>
-    <w:basedOn w:val="Normal"/>
+    <w:basedOn w:val="Normale"/>
     <w:uiPriority w:val="34"/>
     <w:qFormat/>
     <w:rsid w:val="004E1BAC"/>
@@ -4434,9 +5463,9 @@
       <w:contextualSpacing/>
     </w:pPr>
   </w:style>
-  <w:style w:type="character" w:styleId="IntenseEmphasis">
+  <w:style w:type="character" w:styleId="Enfasiintensa">
     <w:name w:val="Intense Emphasis"/>
-    <w:basedOn w:val="DefaultParagraphFont"/>
+    <w:basedOn w:val="Carpredefinitoparagrafo"/>
     <w:uiPriority w:val="21"/>
     <w:qFormat/>
     <w:rsid w:val="002A24B4"/>
@@ -4446,11 +5475,11 @@
       <w:color w:val="0F4761" w:themeColor="accent1" w:themeShade="BF"/>
     </w:rPr>
   </w:style>
-  <w:style w:type="paragraph" w:styleId="IntenseQuote">
+  <w:style w:type="paragraph" w:styleId="Citazioneintensa">
     <w:name w:val="Intense Quote"/>
-    <w:basedOn w:val="Normal"/>
-    <w:next w:val="Normal"/>
-    <w:link w:val="IntenseQuoteChar"/>
+    <w:basedOn w:val="Normale"/>
+    <w:next w:val="Normale"/>
+    <w:link w:val="CitazioneintensaCarattere"/>
     <w:uiPriority w:val="30"/>
     <w:qFormat/>
     <w:rsid w:val="002A24B4"/>
@@ -4469,10 +5498,10 @@
       <w:color w:val="0F4761" w:themeColor="accent1" w:themeShade="BF"/>
     </w:rPr>
   </w:style>
-  <w:style w:type="character" w:customStyle="1" w:styleId="IntenseQuoteChar">
-    <w:name w:val="Intense Quote Char"/>
-    <w:basedOn w:val="DefaultParagraphFont"/>
-    <w:link w:val="IntenseQuote"/>
+  <w:style w:type="character" w:customStyle="1" w:styleId="CitazioneintensaCarattere">
+    <w:name w:val="Citazione intensa Carattere"/>
+    <w:basedOn w:val="Carpredefinitoparagrafo"/>
+    <w:link w:val="Citazioneintensa"/>
     <w:uiPriority w:val="30"/>
     <w:rsid w:val="002A24B4"/>
     <w:rPr>
@@ -4481,9 +5510,9 @@
       <w:color w:val="0F4761" w:themeColor="accent1" w:themeShade="BF"/>
     </w:rPr>
   </w:style>
-  <w:style w:type="character" w:styleId="IntenseReference">
+  <w:style w:type="character" w:styleId="Riferimentointenso">
     <w:name w:val="Intense Reference"/>
-    <w:basedOn w:val="DefaultParagraphFont"/>
+    <w:basedOn w:val="Carpredefinitoparagrafo"/>
     <w:uiPriority w:val="32"/>
     <w:qFormat/>
     <w:rsid w:val="002A24B4"/>
@@ -4495,9 +5524,9 @@
       <w:spacing w:val="5"/>
     </w:rPr>
   </w:style>
-  <w:style w:type="table" w:styleId="TableGrid">
+  <w:style w:type="table" w:styleId="Grigliatabella">
     <w:name w:val="Table Grid"/>
-    <w:basedOn w:val="TableNormal"/>
+    <w:basedOn w:val="Tabellanormale"/>
     <w:uiPriority w:val="39"/>
     <w:rsid w:val="002A24B4"/>
     <w:pPr>
@@ -4516,7 +5545,7 @@
   </w:style>
   <w:style w:type="paragraph" w:customStyle="1" w:styleId="Abstract">
     <w:name w:val="Abstract"/>
-    <w:basedOn w:val="Normal"/>
+    <w:basedOn w:val="Normale"/>
     <w:link w:val="AbstractCarattere"/>
     <w:qFormat/>
     <w:rsid w:val="00F2380A"/>
@@ -4528,7 +5557,7 @@
   </w:style>
   <w:style w:type="character" w:customStyle="1" w:styleId="AbstractCarattere">
     <w:name w:val="Abstract Carattere"/>
-    <w:basedOn w:val="DefaultParagraphFont"/>
+    <w:basedOn w:val="Carpredefinitoparagrafo"/>
     <w:link w:val="Abstract"/>
     <w:rsid w:val="00F2380A"/>
     <w:rPr>
@@ -4541,7 +5570,7 @@
   </w:style>
   <w:style w:type="paragraph" w:customStyle="1" w:styleId="Authors">
     <w:name w:val="Authors"/>
-    <w:basedOn w:val="Normal"/>
+    <w:basedOn w:val="Normale"/>
     <w:link w:val="AuthorsCarattere"/>
     <w:qFormat/>
     <w:rsid w:val="001F2C6C"/>
@@ -4554,7 +5583,7 @@
   </w:style>
   <w:style w:type="character" w:customStyle="1" w:styleId="AuthorsCarattere">
     <w:name w:val="Authors Carattere"/>
-    <w:basedOn w:val="DefaultParagraphFont"/>
+    <w:basedOn w:val="Carpredefinitoparagrafo"/>
     <w:link w:val="Authors"/>
     <w:rsid w:val="001F2C6C"/>
     <w:rPr>
@@ -4562,10 +5591,10 @@
       <w:lang w:val="en-US"/>
     </w:rPr>
   </w:style>
-  <w:style w:type="paragraph" w:styleId="Caption">
+  <w:style w:type="paragraph" w:styleId="Didascalia">
     <w:name w:val="caption"/>
-    <w:basedOn w:val="Normal"/>
-    <w:next w:val="Normal"/>
+    <w:basedOn w:val="Normale"/>
+    <w:next w:val="Normale"/>
     <w:uiPriority w:val="35"/>
     <w:unhideWhenUsed/>
     <w:qFormat/>
@@ -4581,9 +5610,9 @@
       <w:szCs w:val="18"/>
     </w:rPr>
   </w:style>
-  <w:style w:type="character" w:styleId="Hyperlink">
+  <w:style w:type="character" w:styleId="Collegamentoipertestuale">
     <w:name w:val="Hyperlink"/>
-    <w:basedOn w:val="DefaultParagraphFont"/>
+    <w:basedOn w:val="Carpredefinitoparagrafo"/>
     <w:uiPriority w:val="99"/>
     <w:unhideWhenUsed/>
     <w:rsid w:val="00712B2D"/>
@@ -4592,9 +5621,9 @@
       <w:u w:val="single"/>
     </w:rPr>
   </w:style>
-  <w:style w:type="character" w:styleId="UnresolvedMention">
+  <w:style w:type="character" w:styleId="Menzionenonrisolta">
     <w:name w:val="Unresolved Mention"/>
-    <w:basedOn w:val="DefaultParagraphFont"/>
+    <w:basedOn w:val="Carpredefinitoparagrafo"/>
     <w:uiPriority w:val="99"/>
     <w:semiHidden/>
     <w:unhideWhenUsed/>
@@ -4604,9 +5633,9 @@
       <w:shd w:val="clear" w:color="auto" w:fill="E1DFDD"/>
     </w:rPr>
   </w:style>
-  <w:style w:type="character" w:styleId="FollowedHyperlink">
+  <w:style w:type="character" w:styleId="Collegamentovisitato">
     <w:name w:val="FollowedHyperlink"/>
-    <w:basedOn w:val="DefaultParagraphFont"/>
+    <w:basedOn w:val="Carpredefinitoparagrafo"/>
     <w:uiPriority w:val="99"/>
     <w:semiHidden/>
     <w:unhideWhenUsed/>
@@ -4923,7 +5952,12 @@
 </file>
 
 <file path=customXml/item2.xml><?xml version="1.0" encoding="utf-8"?>
-<b:Sources xmlns:b="http://schemas.openxmlformats.org/officeDocument/2006/bibliography" xmlns="http://schemas.openxmlformats.org/officeDocument/2006/bibliography" SelectedStyle="\APASixthEditionOfficeOnline.xsl" StyleName="APA" Version="6"/>
+<?mso-contentType ?>
+<FormTemplates xmlns="http://schemas.microsoft.com/sharepoint/v3/contenttype/forms">
+  <Display>DocumentLibraryForm</Display>
+  <Edit>DocumentLibraryForm</Edit>
+  <New>DocumentLibraryForm</New>
+</FormTemplates>
 </file>
 
 <file path=customXml/item3.xml><?xml version="1.0" encoding="utf-8"?>
@@ -5079,12 +6113,7 @@
 </file>
 
 <file path=customXml/item4.xml><?xml version="1.0" encoding="utf-8"?>
-<?mso-contentType ?>
-<FormTemplates xmlns="http://schemas.microsoft.com/sharepoint/v3/contenttype/forms">
-  <Display>DocumentLibraryForm</Display>
-  <Edit>DocumentLibraryForm</Edit>
-  <New>DocumentLibraryForm</New>
-</FormTemplates>
+<b:Sources xmlns:b="http://schemas.openxmlformats.org/officeDocument/2006/bibliography" xmlns="http://schemas.openxmlformats.org/officeDocument/2006/bibliography" SelectedStyle="\APASixthEditionOfficeOnline.xsl" StyleName="APA" Version="6"/>
 </file>
 
 <file path=customXml/itemProps1.xml><?xml version="1.0" encoding="utf-8"?>
@@ -5098,9 +6127,9 @@
 </file>
 
 <file path=customXml/itemProps2.xml><?xml version="1.0" encoding="utf-8"?>
-<ds:datastoreItem xmlns:ds="http://schemas.openxmlformats.org/officeDocument/2006/customXml" ds:itemID="{6E22CA76-5EB0-4C4B-8B47-860A2B366C62}">
+<ds:datastoreItem xmlns:ds="http://schemas.openxmlformats.org/officeDocument/2006/customXml" ds:itemID="{61E0A4EB-FA0B-46CC-B36A-E61AA4606D75}">
   <ds:schemaRefs>
-    <ds:schemaRef ds:uri="http://schemas.openxmlformats.org/officeDocument/2006/bibliography"/>
+    <ds:schemaRef ds:uri="http://schemas.microsoft.com/sharepoint/v3/contenttype/forms"/>
   </ds:schemaRefs>
 </ds:datastoreItem>
 </file>
@@ -5124,9 +6153,9 @@
 </file>
 
 <file path=customXml/itemProps4.xml><?xml version="1.0" encoding="utf-8"?>
-<ds:datastoreItem xmlns:ds="http://schemas.openxmlformats.org/officeDocument/2006/customXml" ds:itemID="{61E0A4EB-FA0B-46CC-B36A-E61AA4606D75}">
+<ds:datastoreItem xmlns:ds="http://schemas.openxmlformats.org/officeDocument/2006/customXml" ds:itemID="{6E22CA76-5EB0-4C4B-8B47-860A2B366C62}">
   <ds:schemaRefs>
-    <ds:schemaRef ds:uri="http://schemas.microsoft.com/sharepoint/v3/contenttype/forms"/>
+    <ds:schemaRef ds:uri="http://schemas.openxmlformats.org/officeDocument/2006/bibliography"/>
   </ds:schemaRefs>
 </ds:datastoreItem>
 </file>
</xml_diff>